<commit_message>
update modul 13 v1
</commit_message>
<xml_diff>
--- a/assets/file/materi/Modul Pertemuan 13 - Fitur.docx
+++ b/assets/file/materi/Modul Pertemuan 13 - Fitur.docx
@@ -2477,6 +2477,8 @@
       <w:r>
         <w:rPr>
           <w:rFonts w:asciiTheme="majorHAnsi" w:hAnsiTheme="majorHAnsi" w:cstheme="majorHAnsi"/>
+          <w:noProof/>
+          <w:lang w:val="en-US" w:eastAsia="en-US"/>
         </w:rPr>
         <w:drawing>
           <wp:inline distT="0" distB="0" distL="0" distR="0" wp14:anchorId="4FECDAF0" wp14:editId="7CB0BB7C">
@@ -3270,6 +3272,8 @@
       <w:r>
         <w:rPr>
           <w:rFonts w:asciiTheme="majorHAnsi" w:hAnsiTheme="majorHAnsi" w:cstheme="majorHAnsi"/>
+          <w:noProof/>
+          <w:lang w:val="en-US" w:eastAsia="en-US"/>
         </w:rPr>
         <w:drawing>
           <wp:inline distT="0" distB="0" distL="0" distR="0" wp14:anchorId="4409BDC1" wp14:editId="623A67BA">
@@ -3347,15 +3351,7 @@
           <w:b/>
           <w:bCs/>
         </w:rPr>
-        <w:t>dashboard</w:t>
-      </w:r>
-      <w:r>
-        <w:rPr>
-          <w:rFonts w:asciiTheme="majorHAnsi" w:hAnsiTheme="majorHAnsi"/>
-          <w:b/>
-          <w:bCs/>
-        </w:rPr>
-        <w:t>.php</w:t>
+        <w:t>dashboard.php</w:t>
       </w:r>
       <w:r>
         <w:rPr>
@@ -3409,6 +3405,8 @@
       <w:r>
         <w:rPr>
           <w:rFonts w:asciiTheme="majorHAnsi" w:hAnsiTheme="majorHAnsi" w:cstheme="majorHAnsi"/>
+          <w:noProof/>
+          <w:lang w:val="en-US" w:eastAsia="en-US"/>
         </w:rPr>
         <w:drawing>
           <wp:inline distT="0" distB="0" distL="0" distR="0" wp14:anchorId="30469C02" wp14:editId="1378FA3A">
@@ -3505,6 +3503,8 @@
       <w:r>
         <w:rPr>
           <w:rFonts w:asciiTheme="majorHAnsi" w:hAnsiTheme="majorHAnsi" w:cstheme="majorHAnsi"/>
+          <w:noProof/>
+          <w:lang w:val="en-US" w:eastAsia="en-US"/>
         </w:rPr>
         <w:drawing>
           <wp:inline distT="0" distB="0" distL="0" distR="0" wp14:anchorId="432EE132" wp14:editId="7882153A">
@@ -3601,6 +3601,8 @@
       <w:r>
         <w:rPr>
           <w:rFonts w:asciiTheme="majorHAnsi" w:hAnsiTheme="majorHAnsi" w:cstheme="majorHAnsi"/>
+          <w:noProof/>
+          <w:lang w:val="en-US" w:eastAsia="en-US"/>
         </w:rPr>
         <w:drawing>
           <wp:inline distT="0" distB="0" distL="0" distR="0" wp14:anchorId="645A9461" wp14:editId="6967D943">
@@ -3683,6 +3685,8 @@
           <w:rFonts w:asciiTheme="majorHAnsi" w:hAnsiTheme="majorHAnsi" w:cstheme="majorHAnsi"/>
           <w:b/>
           <w:bCs/>
+          <w:noProof/>
+          <w:lang w:val="en-US" w:eastAsia="en-US"/>
         </w:rPr>
         <w:drawing>
           <wp:inline distT="0" distB="0" distL="0" distR="0" wp14:anchorId="0A5B1891" wp14:editId="57F4C837">
@@ -3779,6 +3783,8 @@
       <w:r>
         <w:rPr>
           <w:rFonts w:asciiTheme="majorHAnsi" w:hAnsiTheme="majorHAnsi" w:cstheme="majorHAnsi"/>
+          <w:noProof/>
+          <w:lang w:val="en-US" w:eastAsia="en-US"/>
         </w:rPr>
         <w:drawing>
           <wp:inline distT="0" distB="0" distL="0" distR="0" wp14:anchorId="0950CB70" wp14:editId="7B9941E7">
@@ -3916,6 +3922,8 @@
       <w:r>
         <w:rPr>
           <w:rFonts w:asciiTheme="majorHAnsi" w:hAnsiTheme="majorHAnsi" w:cstheme="majorHAnsi"/>
+          <w:noProof/>
+          <w:lang w:val="en-US" w:eastAsia="en-US"/>
         </w:rPr>
         <w:drawing>
           <wp:inline distT="0" distB="0" distL="0" distR="0" wp14:anchorId="0CFDEEAD" wp14:editId="1E6663FB">
@@ -4048,6 +4056,8 @@
       <w:r>
         <w:rPr>
           <w:rFonts w:asciiTheme="majorHAnsi" w:hAnsiTheme="majorHAnsi" w:cstheme="majorHAnsi"/>
+          <w:noProof/>
+          <w:lang w:val="en-US" w:eastAsia="en-US"/>
         </w:rPr>
         <w:drawing>
           <wp:inline distT="0" distB="0" distL="0" distR="0" wp14:anchorId="305F640F" wp14:editId="67005E0C">
@@ -4158,6 +4168,8 @@
       <w:r>
         <w:rPr>
           <w:rFonts w:asciiTheme="majorHAnsi" w:hAnsiTheme="majorHAnsi" w:cstheme="majorHAnsi"/>
+          <w:noProof/>
+          <w:lang w:val="en-US" w:eastAsia="en-US"/>
         </w:rPr>
         <w:drawing>
           <wp:inline distT="0" distB="0" distL="0" distR="0" wp14:anchorId="29DB2739" wp14:editId="577C6F07">
@@ -4254,6 +4266,8 @@
       <w:r>
         <w:rPr>
           <w:rFonts w:asciiTheme="majorHAnsi" w:hAnsiTheme="majorHAnsi" w:cstheme="majorHAnsi"/>
+          <w:noProof/>
+          <w:lang w:val="en-US" w:eastAsia="en-US"/>
         </w:rPr>
         <w:drawing>
           <wp:inline distT="0" distB="0" distL="0" distR="0" wp14:anchorId="2946F392" wp14:editId="21FAE5B5">
@@ -4350,6 +4364,8 @@
       <w:r>
         <w:rPr>
           <w:rFonts w:asciiTheme="majorHAnsi" w:hAnsiTheme="majorHAnsi" w:cstheme="majorHAnsi"/>
+          <w:noProof/>
+          <w:lang w:val="en-US" w:eastAsia="en-US"/>
         </w:rPr>
         <w:drawing>
           <wp:inline distT="0" distB="0" distL="0" distR="0" wp14:anchorId="6082CB26" wp14:editId="14B85536">
@@ -4446,6 +4462,8 @@
       <w:r>
         <w:rPr>
           <w:rFonts w:asciiTheme="majorHAnsi" w:hAnsiTheme="majorHAnsi" w:cstheme="majorHAnsi"/>
+          <w:noProof/>
+          <w:lang w:val="en-US" w:eastAsia="en-US"/>
         </w:rPr>
         <w:drawing>
           <wp:inline distT="0" distB="0" distL="0" distR="0" wp14:anchorId="2FFB91B0" wp14:editId="6110E222">
@@ -4542,6 +4560,8 @@
       <w:r>
         <w:rPr>
           <w:rFonts w:asciiTheme="majorHAnsi" w:hAnsiTheme="majorHAnsi" w:cstheme="majorHAnsi"/>
+          <w:noProof/>
+          <w:lang w:val="en-US" w:eastAsia="en-US"/>
         </w:rPr>
         <w:drawing>
           <wp:inline distT="0" distB="0" distL="0" distR="0" wp14:anchorId="38E1AA78" wp14:editId="44558261">
@@ -4652,6 +4672,8 @@
       <w:r>
         <w:rPr>
           <w:rFonts w:asciiTheme="majorHAnsi" w:hAnsiTheme="majorHAnsi" w:cstheme="majorHAnsi"/>
+          <w:noProof/>
+          <w:lang w:val="en-US" w:eastAsia="en-US"/>
         </w:rPr>
         <w:drawing>
           <wp:inline distT="0" distB="0" distL="0" distR="0" wp14:anchorId="479727E5" wp14:editId="0CE25B34">
@@ -4748,6 +4770,8 @@
       <w:r>
         <w:rPr>
           <w:rFonts w:asciiTheme="majorHAnsi" w:hAnsiTheme="majorHAnsi" w:cstheme="majorHAnsi"/>
+          <w:noProof/>
+          <w:lang w:val="en-US" w:eastAsia="en-US"/>
         </w:rPr>
         <w:drawing>
           <wp:inline distT="0" distB="0" distL="0" distR="0" wp14:anchorId="2CFBCC4A" wp14:editId="52D908E6">
@@ -4789,28 +4813,6 @@
     <w:p>
       <w:pPr>
         <w:pStyle w:val="ListParagraph"/>
-        <w:jc w:val="both"/>
-        <w:rPr>
-          <w:rFonts w:asciiTheme="majorHAnsi" w:hAnsiTheme="majorHAnsi" w:cstheme="majorHAnsi"/>
-        </w:rPr>
-      </w:pPr>
-    </w:p>
-    <w:p>
-      <w:pPr>
-        <w:rPr>
-          <w:rFonts w:asciiTheme="majorHAnsi" w:hAnsiTheme="majorHAnsi" w:cstheme="majorHAnsi"/>
-        </w:rPr>
-      </w:pPr>
-      <w:r>
-        <w:rPr>
-          <w:rFonts w:asciiTheme="majorHAnsi" w:hAnsiTheme="majorHAnsi" w:cstheme="majorHAnsi"/>
-        </w:rPr>
-        <w:br w:type="page"/>
-      </w:r>
-    </w:p>
-    <w:p>
-      <w:pPr>
-        <w:pStyle w:val="ListParagraph"/>
         <w:numPr>
           <w:ilvl w:val="0"/>
           <w:numId w:val="14"/>
@@ -4822,47 +4824,57 @@
       </w:pPr>
       <w:r>
         <w:rPr>
-          <w:rFonts w:ascii="Calibri" w:eastAsia="Calibri" w:hAnsi="Calibri" w:cs="Calibri"/>
-          <w:szCs w:val="22"/>
-          <w:lang w:val="id" w:eastAsia="en-US"/>
-        </w:rPr>
-        <w:lastRenderedPageBreak/>
-        <w:t>Jalankan</w:t>
-      </w:r>
-      <w:r>
-        <w:rPr>
-          <w:rFonts w:ascii="Calibri" w:eastAsia="Calibri" w:hAnsi="Calibri" w:cs="Calibri"/>
-          <w:szCs w:val="22"/>
-          <w:lang w:eastAsia="en-US"/>
+          <w:rFonts w:asciiTheme="majorHAnsi" w:hAnsiTheme="majorHAnsi" w:cstheme="majorHAnsi"/>
+        </w:rPr>
+        <w:t>Buka file</w:t>
+      </w:r>
+      <w:r>
+        <w:rPr>
+          <w:rFonts w:asciiTheme="majorHAnsi" w:hAnsiTheme="majorHAnsi" w:cstheme="majorHAnsi"/>
         </w:rPr>
         <w:t xml:space="preserve"> </w:t>
       </w:r>
       <w:r>
         <w:rPr>
-          <w:rFonts w:ascii="Calibri" w:eastAsia="Calibri" w:hAnsi="Calibri" w:cs="Calibri"/>
+          <w:rFonts w:asciiTheme="majorHAnsi" w:hAnsiTheme="majorHAnsi" w:cstheme="majorHAnsi"/>
           <w:b/>
           <w:bCs/>
-          <w:szCs w:val="22"/>
-          <w:lang w:eastAsia="en-US"/>
-        </w:rPr>
-        <w:t>localhost:8080/Produk_Admin</w:t>
-      </w:r>
-      <w:r>
-        <w:rPr>
-          <w:rFonts w:ascii="Calibri" w:eastAsia="Calibri" w:hAnsi="Calibri" w:cs="Calibri"/>
-          <w:color w:val="0000FF"/>
-          <w:szCs w:val="22"/>
-          <w:lang w:eastAsia="en-US"/>
-        </w:rPr>
-        <w:t xml:space="preserve">, </w:t>
-      </w:r>
-      <w:r>
-        <w:t>Maka akan tampil seperti gambar dibawah</w:t>
+        </w:rPr>
+        <w:t>Dashboard</w:t>
+      </w:r>
+      <w:r>
+        <w:rPr>
+          <w:rFonts w:asciiTheme="majorHAnsi" w:hAnsiTheme="majorHAnsi" w:cstheme="majorHAnsi"/>
+          <w:b/>
+          <w:bCs/>
+        </w:rPr>
+        <w:t xml:space="preserve">.php </w:t>
+      </w:r>
+      <w:r>
+        <w:rPr>
+          <w:rFonts w:asciiTheme="majorHAnsi" w:hAnsiTheme="majorHAnsi" w:cstheme="majorHAnsi"/>
+        </w:rPr>
+        <w:t xml:space="preserve">edit function </w:t>
+      </w:r>
+      <w:r>
+        <w:rPr>
+          <w:rFonts w:asciiTheme="majorHAnsi" w:hAnsiTheme="majorHAnsi" w:cstheme="majorHAnsi"/>
+          <w:b/>
+          <w:bCs/>
+        </w:rPr>
+        <w:t>index</w:t>
+      </w:r>
+      <w:r>
+        <w:rPr>
+          <w:rFonts w:asciiTheme="majorHAnsi" w:hAnsiTheme="majorHAnsi" w:cstheme="majorHAnsi"/>
+        </w:rPr>
+        <w:t xml:space="preserve"> menjadi seperti gambar berikut</w:t>
       </w:r>
     </w:p>
     <w:p>
       <w:pPr>
         <w:pStyle w:val="ListParagraph"/>
+        <w:jc w:val="both"/>
         <w:rPr>
           <w:rFonts w:asciiTheme="majorHAnsi" w:hAnsiTheme="majorHAnsi" w:cstheme="majorHAnsi"/>
         </w:rPr>
@@ -4872,10 +4884,10 @@
           <w:rFonts w:asciiTheme="majorHAnsi" w:hAnsiTheme="majorHAnsi" w:cstheme="majorHAnsi"/>
         </w:rPr>
         <w:drawing>
-          <wp:inline distT="0" distB="0" distL="0" distR="0" wp14:anchorId="7FB81C7B" wp14:editId="7D86E0E0">
-            <wp:extent cx="5040000" cy="2675077"/>
-            <wp:effectExtent l="0" t="0" r="8255" b="0"/>
-            <wp:docPr id="261" name="Picture 261"/>
+          <wp:inline distT="0" distB="0" distL="0" distR="0" wp14:anchorId="470D009B" wp14:editId="58DD0B61">
+            <wp:extent cx="3210373" cy="952633"/>
+            <wp:effectExtent l="0" t="0" r="9525" b="0"/>
+            <wp:docPr id="13" name="Picture 13"/>
             <wp:cNvGraphicFramePr>
               <a:graphicFrameLocks xmlns:a="http://schemas.openxmlformats.org/drawingml/2006/main" noChangeAspect="1"/>
             </wp:cNvGraphicFramePr>
@@ -4895,7 +4907,7 @@
                   <pic:spPr>
                     <a:xfrm>
                       <a:off x="0" y="0"/>
-                      <a:ext cx="5040000" cy="2675077"/>
+                      <a:ext cx="3210373" cy="952633"/>
                     </a:xfrm>
                     <a:prstGeom prst="rect">
                       <a:avLst/>
@@ -4907,33 +4919,81 @@
           </wp:inline>
         </w:drawing>
       </w:r>
+      <w:bookmarkStart w:id="0" w:name="_GoBack"/>
+      <w:bookmarkEnd w:id="0"/>
     </w:p>
     <w:p>
       <w:pPr>
         <w:pStyle w:val="ListParagraph"/>
-        <w:rPr>
-          <w:rFonts w:asciiTheme="majorHAnsi" w:hAnsiTheme="majorHAnsi" w:cstheme="majorHAnsi"/>
-        </w:rPr>
-      </w:pPr>
-      <w:r>
-        <w:rPr>
-          <w:rFonts w:asciiTheme="majorHAnsi" w:hAnsiTheme="majorHAnsi" w:cstheme="majorHAnsi"/>
-        </w:rPr>
-        <w:t xml:space="preserve">Pilih kategori </w:t>
-      </w:r>
-      <w:r>
-        <w:rPr>
-          <w:rFonts w:asciiTheme="majorHAnsi" w:hAnsiTheme="majorHAnsi" w:cstheme="majorHAnsi"/>
+        <w:jc w:val="both"/>
+        <w:rPr>
+          <w:rFonts w:asciiTheme="majorHAnsi" w:hAnsiTheme="majorHAnsi" w:cstheme="majorHAnsi"/>
+        </w:rPr>
+      </w:pPr>
+    </w:p>
+    <w:p>
+      <w:pPr>
+        <w:rPr>
+          <w:rFonts w:asciiTheme="majorHAnsi" w:hAnsiTheme="majorHAnsi" w:cstheme="majorHAnsi"/>
+        </w:rPr>
+      </w:pPr>
+      <w:r>
+        <w:rPr>
+          <w:rFonts w:asciiTheme="majorHAnsi" w:hAnsiTheme="majorHAnsi" w:cstheme="majorHAnsi"/>
+        </w:rPr>
+        <w:br w:type="page"/>
+      </w:r>
+    </w:p>
+    <w:p>
+      <w:pPr>
+        <w:pStyle w:val="ListParagraph"/>
+        <w:numPr>
+          <w:ilvl w:val="0"/>
+          <w:numId w:val="14"/>
+        </w:numPr>
+        <w:jc w:val="both"/>
+        <w:rPr>
+          <w:rFonts w:asciiTheme="majorHAnsi" w:hAnsiTheme="majorHAnsi" w:cstheme="majorHAnsi"/>
+        </w:rPr>
+      </w:pPr>
+      <w:r>
+        <w:rPr>
+          <w:rFonts w:ascii="Calibri" w:eastAsia="Calibri" w:hAnsi="Calibri" w:cs="Calibri"/>
+          <w:szCs w:val="22"/>
+          <w:lang w:val="id" w:eastAsia="en-US"/>
+        </w:rPr>
+        <w:lastRenderedPageBreak/>
+        <w:t>Jalankan</w:t>
+      </w:r>
+      <w:r>
+        <w:rPr>
+          <w:rFonts w:ascii="Calibri" w:eastAsia="Calibri" w:hAnsi="Calibri" w:cs="Calibri"/>
+          <w:szCs w:val="22"/>
+          <w:lang w:eastAsia="en-US"/>
+        </w:rPr>
+        <w:t xml:space="preserve"> </w:t>
+      </w:r>
+      <w:r>
+        <w:rPr>
+          <w:rFonts w:ascii="Calibri" w:eastAsia="Calibri" w:hAnsi="Calibri" w:cs="Calibri"/>
           <w:b/>
           <w:bCs/>
-        </w:rPr>
-        <w:t>smarphone</w:t>
-      </w:r>
-      <w:r>
-        <w:rPr>
-          <w:rFonts w:asciiTheme="majorHAnsi" w:hAnsiTheme="majorHAnsi" w:cstheme="majorHAnsi"/>
-        </w:rPr>
-        <w:t xml:space="preserve"> maka akan tampil seperti gambar dibawah ini</w:t>
+          <w:szCs w:val="22"/>
+          <w:lang w:eastAsia="en-US"/>
+        </w:rPr>
+        <w:t>localhost:8080/Produk_Admin</w:t>
+      </w:r>
+      <w:r>
+        <w:rPr>
+          <w:rFonts w:ascii="Calibri" w:eastAsia="Calibri" w:hAnsi="Calibri" w:cs="Calibri"/>
+          <w:color w:val="0000FF"/>
+          <w:szCs w:val="22"/>
+          <w:lang w:eastAsia="en-US"/>
+        </w:rPr>
+        <w:t xml:space="preserve">, </w:t>
+      </w:r>
+      <w:r>
+        <w:t>Maka akan tampil seperti gambar dibawah</w:t>
       </w:r>
     </w:p>
     <w:p>
@@ -4943,16 +5003,17 @@
           <w:rFonts w:asciiTheme="majorHAnsi" w:hAnsiTheme="majorHAnsi" w:cstheme="majorHAnsi"/>
         </w:rPr>
       </w:pPr>
-      <w:bookmarkStart w:id="0" w:name="_GoBack"/>
-      <w:r>
-        <w:rPr>
-          <w:rFonts w:asciiTheme="majorHAnsi" w:hAnsiTheme="majorHAnsi" w:cstheme="majorHAnsi"/>
+      <w:r>
+        <w:rPr>
+          <w:rFonts w:asciiTheme="majorHAnsi" w:hAnsiTheme="majorHAnsi" w:cstheme="majorHAnsi"/>
+          <w:noProof/>
+          <w:lang w:val="en-US" w:eastAsia="en-US"/>
         </w:rPr>
         <w:drawing>
-          <wp:inline distT="0" distB="0" distL="0" distR="0" wp14:anchorId="3B33B6BF" wp14:editId="3DEA094A">
-            <wp:extent cx="5040000" cy="2671308"/>
+          <wp:inline distT="0" distB="0" distL="0" distR="0" wp14:anchorId="7FB81C7B" wp14:editId="7D86E0E0">
+            <wp:extent cx="5040000" cy="2675077"/>
             <wp:effectExtent l="0" t="0" r="8255" b="0"/>
-            <wp:docPr id="268" name="Picture 268"/>
+            <wp:docPr id="261" name="Picture 261"/>
             <wp:cNvGraphicFramePr>
               <a:graphicFrameLocks xmlns:a="http://schemas.openxmlformats.org/drawingml/2006/main" noChangeAspect="1"/>
             </wp:cNvGraphicFramePr>
@@ -4972,6 +5033,84 @@
                   <pic:spPr>
                     <a:xfrm>
                       <a:off x="0" y="0"/>
+                      <a:ext cx="5040000" cy="2675077"/>
+                    </a:xfrm>
+                    <a:prstGeom prst="rect">
+                      <a:avLst/>
+                    </a:prstGeom>
+                  </pic:spPr>
+                </pic:pic>
+              </a:graphicData>
+            </a:graphic>
+          </wp:inline>
+        </w:drawing>
+      </w:r>
+    </w:p>
+    <w:p>
+      <w:pPr>
+        <w:pStyle w:val="ListParagraph"/>
+        <w:rPr>
+          <w:rFonts w:asciiTheme="majorHAnsi" w:hAnsiTheme="majorHAnsi" w:cstheme="majorHAnsi"/>
+        </w:rPr>
+      </w:pPr>
+      <w:r>
+        <w:rPr>
+          <w:rFonts w:asciiTheme="majorHAnsi" w:hAnsiTheme="majorHAnsi" w:cstheme="majorHAnsi"/>
+        </w:rPr>
+        <w:t xml:space="preserve">Pilih kategori </w:t>
+      </w:r>
+      <w:r>
+        <w:rPr>
+          <w:rFonts w:asciiTheme="majorHAnsi" w:hAnsiTheme="majorHAnsi" w:cstheme="majorHAnsi"/>
+          <w:b/>
+          <w:bCs/>
+        </w:rPr>
+        <w:t>smarphone</w:t>
+      </w:r>
+      <w:r>
+        <w:rPr>
+          <w:rFonts w:asciiTheme="majorHAnsi" w:hAnsiTheme="majorHAnsi" w:cstheme="majorHAnsi"/>
+        </w:rPr>
+        <w:t xml:space="preserve"> maka akan tampil seperti gambar dibawah ini</w:t>
+      </w:r>
+    </w:p>
+    <w:p>
+      <w:pPr>
+        <w:pStyle w:val="ListParagraph"/>
+        <w:rPr>
+          <w:rFonts w:asciiTheme="majorHAnsi" w:hAnsiTheme="majorHAnsi" w:cstheme="majorHAnsi"/>
+        </w:rPr>
+      </w:pPr>
+      <w:r>
+        <w:rPr>
+          <w:rFonts w:asciiTheme="majorHAnsi" w:hAnsiTheme="majorHAnsi" w:cstheme="majorHAnsi"/>
+          <w:noProof/>
+          <w:lang w:val="en-US" w:eastAsia="en-US"/>
+        </w:rPr>
+        <w:drawing>
+          <wp:inline distT="0" distB="0" distL="0" distR="0" wp14:anchorId="3B33B6BF" wp14:editId="3DEA094A">
+            <wp:extent cx="5040000" cy="2671308"/>
+            <wp:effectExtent l="0" t="0" r="8255" b="0"/>
+            <wp:docPr id="268" name="Picture 268"/>
+            <wp:cNvGraphicFramePr>
+              <a:graphicFrameLocks xmlns:a="http://schemas.openxmlformats.org/drawingml/2006/main" noChangeAspect="1"/>
+            </wp:cNvGraphicFramePr>
+            <a:graphic xmlns:a="http://schemas.openxmlformats.org/drawingml/2006/main">
+              <a:graphicData uri="http://schemas.openxmlformats.org/drawingml/2006/picture">
+                <pic:pic xmlns:pic="http://schemas.openxmlformats.org/drawingml/2006/picture">
+                  <pic:nvPicPr>
+                    <pic:cNvPr id="0" name=""/>
+                    <pic:cNvPicPr/>
+                  </pic:nvPicPr>
+                  <pic:blipFill>
+                    <a:blip r:embed="rId41"/>
+                    <a:stretch>
+                      <a:fillRect/>
+                    </a:stretch>
+                  </pic:blipFill>
+                  <pic:spPr>
+                    <a:xfrm>
+                      <a:off x="0" y="0"/>
                       <a:ext cx="5040000" cy="2671308"/>
                     </a:xfrm>
                     <a:prstGeom prst="rect">
@@ -4984,7 +5123,6 @@
           </wp:inline>
         </w:drawing>
       </w:r>
-      <w:bookmarkEnd w:id="0"/>
     </w:p>
     <w:p>
       <w:pPr>
@@ -5136,10 +5274,10 @@
       </w:pPr>
     </w:p>
     <w:sectPr>
-      <w:headerReference w:type="default" r:id="rId41"/>
-      <w:footerReference w:type="default" r:id="rId42"/>
-      <w:headerReference w:type="first" r:id="rId43"/>
-      <w:footerReference w:type="first" r:id="rId44"/>
+      <w:headerReference w:type="default" r:id="rId42"/>
+      <w:footerReference w:type="default" r:id="rId43"/>
+      <w:headerReference w:type="first" r:id="rId44"/>
+      <w:footerReference w:type="first" r:id="rId45"/>
       <w:pgSz w:w="11907" w:h="16840"/>
       <w:pgMar w:top="1418" w:right="1842" w:bottom="1276" w:left="1418" w:header="720" w:footer="720" w:gutter="0"/>
       <w:pgNumType w:start="1"/>
@@ -5215,7 +5353,7 @@
         <w:noProof/>
         <w:color w:val="FFFFFF"/>
       </w:rPr>
-      <w:t>13</w:t>
+      <w:t>12</w:t>
     </w:r>
     <w:r>
       <w:rPr>
@@ -6297,7 +6435,7 @@
                       <wps:cNvPr id="3" name="Parallelogram 12">
                         <a:extLst>
                           <a:ext uri="{FF2B5EF4-FFF2-40B4-BE49-F238E27FC236}">
-                            <a16:creationId xmlns="" xmlns:cx="http://schemas.microsoft.com/office/drawing/2014/chartex" xmlns:cx1="http://schemas.microsoft.com/office/drawing/2015/9/8/chartex" xmlns:cx2="http://schemas.microsoft.com/office/drawing/2015/10/21/chartex" xmlns:cx3="http://schemas.microsoft.com/office/drawing/2016/5/9/chartex" xmlns:cx4="http://schemas.microsoft.com/office/drawing/2016/5/10/chartex" xmlns:cx5="http://schemas.microsoft.com/office/drawing/2016/5/11/chartex" xmlns:cx6="http://schemas.microsoft.com/office/drawing/2016/5/12/chartex" xmlns:cx7="http://schemas.microsoft.com/office/drawing/2016/5/13/chartex" xmlns:cx8="http://schemas.microsoft.com/office/drawing/2016/5/14/chartex" xmlns:aink="http://schemas.microsoft.com/office/drawing/2016/ink" xmlns:am3d="http://schemas.microsoft.com/office/drawing/2017/model3d" xmlns:o="urn:schemas-microsoft-com:office:office" xmlns:oel="http://schemas.microsoft.com/office/2019/extlst" xmlns:v="urn:schemas-microsoft-com:vml" xmlns:w10="urn:schemas-microsoft-com:office:word" xmlns:w="http://schemas.openxmlformats.org/wordprocessingml/2006/main" xmlns:w15="http://schemas.microsoft.com/office/word/2012/wordml" xmlns:w16cex="http://schemas.microsoft.com/office/word/2018/wordml/cex" xmlns:w16cid="http://schemas.microsoft.com/office/word/2016/wordml/cid" xmlns:w16="http://schemas.microsoft.com/office/word/2018/wordml" xmlns:w16du="http://schemas.microsoft.com/office/word/2023/wordml/word16du" xmlns:w16sdtdh="http://schemas.microsoft.com/office/word/2020/wordml/sdtdatahash" xmlns:w16sdtfl="http://schemas.microsoft.com/office/word/2024/wordml/sdtformatlock" xmlns:w16se="http://schemas.microsoft.com/office/word/2015/wordml/symex" xmlns:a16="http://schemas.microsoft.com/office/drawing/2014/main" id="{0DF4DB2E-1B08-B444-B2FC-E7FB68181731}"/>
+                            <a16:creationId xmlns:a16="http://schemas.microsoft.com/office/drawing/2014/main" xmlns:w16se="http://schemas.microsoft.com/office/word/2015/wordml/symex" xmlns:w16sdtfl="http://schemas.microsoft.com/office/word/2024/wordml/sdtformatlock" xmlns:w16sdtdh="http://schemas.microsoft.com/office/word/2020/wordml/sdtdatahash" xmlns:w16du="http://schemas.microsoft.com/office/word/2023/wordml/word16du" xmlns:w16="http://schemas.microsoft.com/office/word/2018/wordml" xmlns:w16cid="http://schemas.microsoft.com/office/word/2016/wordml/cid" xmlns:w16cex="http://schemas.microsoft.com/office/word/2018/wordml/cex" xmlns:w15="http://schemas.microsoft.com/office/word/2012/wordml" xmlns:w="http://schemas.openxmlformats.org/wordprocessingml/2006/main" xmlns:w10="urn:schemas-microsoft-com:office:word" xmlns:v="urn:schemas-microsoft-com:vml" xmlns:oel="http://schemas.microsoft.com/office/2019/extlst" xmlns:o="urn:schemas-microsoft-com:office:office" xmlns:am3d="http://schemas.microsoft.com/office/drawing/2017/model3d" xmlns:aink="http://schemas.microsoft.com/office/drawing/2016/ink" xmlns:cx8="http://schemas.microsoft.com/office/drawing/2016/5/14/chartex" xmlns:cx7="http://schemas.microsoft.com/office/drawing/2016/5/13/chartex" xmlns:cx6="http://schemas.microsoft.com/office/drawing/2016/5/12/chartex" xmlns:cx5="http://schemas.microsoft.com/office/drawing/2016/5/11/chartex" xmlns:cx4="http://schemas.microsoft.com/office/drawing/2016/5/10/chartex" xmlns:cx3="http://schemas.microsoft.com/office/drawing/2016/5/9/chartex" xmlns:cx2="http://schemas.microsoft.com/office/drawing/2015/10/21/chartex" xmlns:cx1="http://schemas.microsoft.com/office/drawing/2015/9/8/chartex" xmlns:cx="http://schemas.microsoft.com/office/drawing/2014/chartex" xmlns="" id="{0DF4DB2E-1B08-B444-B2FC-E7FB68181731}"/>
                           </a:ext>
                         </a:extLst>
                       </wps:cNvPr>
@@ -6730,7 +6868,7 @@
             </wp:anchor>
           </w:drawing>
         </mc:Choice>
-        <mc:Fallback xmlns:cx="http://schemas.microsoft.com/office/drawing/2014/chartex" xmlns:cx1="http://schemas.microsoft.com/office/drawing/2015/9/8/chartex" xmlns:cx2="http://schemas.microsoft.com/office/drawing/2015/10/21/chartex" xmlns:cx3="http://schemas.microsoft.com/office/drawing/2016/5/9/chartex" xmlns:cx4="http://schemas.microsoft.com/office/drawing/2016/5/10/chartex" xmlns:cx5="http://schemas.microsoft.com/office/drawing/2016/5/11/chartex" xmlns:cx6="http://schemas.microsoft.com/office/drawing/2016/5/12/chartex" xmlns:cx7="http://schemas.microsoft.com/office/drawing/2016/5/13/chartex" xmlns:cx8="http://schemas.microsoft.com/office/drawing/2016/5/14/chartex" xmlns:aink="http://schemas.microsoft.com/office/drawing/2016/ink" xmlns:am3d="http://schemas.microsoft.com/office/drawing/2017/model3d" xmlns:oel="http://schemas.microsoft.com/office/2019/extlst" xmlns:w15="http://schemas.microsoft.com/office/word/2012/wordml" xmlns:w16cex="http://schemas.microsoft.com/office/word/2018/wordml/cex" xmlns:w16cid="http://schemas.microsoft.com/office/word/2016/wordml/cid" xmlns:w16="http://schemas.microsoft.com/office/word/2018/wordml" xmlns:w16du="http://schemas.microsoft.com/office/word/2023/wordml/word16du" xmlns:w16sdtdh="http://schemas.microsoft.com/office/word/2020/wordml/sdtdatahash" xmlns:w16sdtfl="http://schemas.microsoft.com/office/word/2024/wordml/sdtformatlock" xmlns:w16se="http://schemas.microsoft.com/office/word/2015/wordml/symex">
+        <mc:Fallback xmlns:w16se="http://schemas.microsoft.com/office/word/2015/wordml/symex" xmlns:w16sdtfl="http://schemas.microsoft.com/office/word/2024/wordml/sdtformatlock" xmlns:w16sdtdh="http://schemas.microsoft.com/office/word/2020/wordml/sdtdatahash" xmlns:w16du="http://schemas.microsoft.com/office/word/2023/wordml/word16du" xmlns:w16="http://schemas.microsoft.com/office/word/2018/wordml" xmlns:w16cid="http://schemas.microsoft.com/office/word/2016/wordml/cid" xmlns:w16cex="http://schemas.microsoft.com/office/word/2018/wordml/cex" xmlns:w15="http://schemas.microsoft.com/office/word/2012/wordml" xmlns:oel="http://schemas.microsoft.com/office/2019/extlst" xmlns:am3d="http://schemas.microsoft.com/office/drawing/2017/model3d" xmlns:aink="http://schemas.microsoft.com/office/drawing/2016/ink" xmlns:cx8="http://schemas.microsoft.com/office/drawing/2016/5/14/chartex" xmlns:cx7="http://schemas.microsoft.com/office/drawing/2016/5/13/chartex" xmlns:cx6="http://schemas.microsoft.com/office/drawing/2016/5/12/chartex" xmlns:cx5="http://schemas.microsoft.com/office/drawing/2016/5/11/chartex" xmlns:cx4="http://schemas.microsoft.com/office/drawing/2016/5/10/chartex" xmlns:cx3="http://schemas.microsoft.com/office/drawing/2016/5/9/chartex" xmlns:cx2="http://schemas.microsoft.com/office/drawing/2015/10/21/chartex" xmlns:cx1="http://schemas.microsoft.com/office/drawing/2015/9/8/chartex" xmlns:cx="http://schemas.microsoft.com/office/drawing/2014/chartex">
           <w:pict>
             <v:group w14:anchorId="20F900BE" id="Group 1" o:spid="_x0000_s1026" style="position:absolute;margin-left:398.25pt;margin-top:-37.45pt;width:159.05pt;height:174.75pt;z-index:251674624;mso-width-relative:margin;mso-height-relative:margin" coordorigin="345" coordsize="18067,19853" o:gfxdata="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">
               <v:shape id="Parallelogram 12" o:spid="_x0000_s1027" style="position:absolute;left:5066;top:6506;width:10950;height:15743;rotation:-75;visibility:visible;mso-wrap-style:square;v-text-anchor:middle" coordsize="1095750,1574861" o:gfxdata="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" path="m,874172l539848,r555902,271253l181009,1574861,,874172xe" fillcolor="#4f81bd [3204]" stroked="f" strokeweight="2pt">
@@ -7087,7 +7225,7 @@
             </wp:anchor>
           </w:drawing>
         </mc:Choice>
-        <mc:Fallback xmlns:cx="http://schemas.microsoft.com/office/drawing/2014/chartex" xmlns:cx1="http://schemas.microsoft.com/office/drawing/2015/9/8/chartex" xmlns:cx2="http://schemas.microsoft.com/office/drawing/2015/10/21/chartex" xmlns:cx3="http://schemas.microsoft.com/office/drawing/2016/5/9/chartex" xmlns:cx4="http://schemas.microsoft.com/office/drawing/2016/5/10/chartex" xmlns:cx5="http://schemas.microsoft.com/office/drawing/2016/5/11/chartex" xmlns:cx6="http://schemas.microsoft.com/office/drawing/2016/5/12/chartex" xmlns:cx7="http://schemas.microsoft.com/office/drawing/2016/5/13/chartex" xmlns:cx8="http://schemas.microsoft.com/office/drawing/2016/5/14/chartex" xmlns:aink="http://schemas.microsoft.com/office/drawing/2016/ink" xmlns:am3d="http://schemas.microsoft.com/office/drawing/2017/model3d" xmlns:oel="http://schemas.microsoft.com/office/2019/extlst" xmlns:w15="http://schemas.microsoft.com/office/word/2012/wordml" xmlns:w16cex="http://schemas.microsoft.com/office/word/2018/wordml/cex" xmlns:w16cid="http://schemas.microsoft.com/office/word/2016/wordml/cid" xmlns:w16="http://schemas.microsoft.com/office/word/2018/wordml" xmlns:w16du="http://schemas.microsoft.com/office/word/2023/wordml/word16du" xmlns:w16sdtdh="http://schemas.microsoft.com/office/word/2020/wordml/sdtdatahash" xmlns:w16sdtfl="http://schemas.microsoft.com/office/word/2024/wordml/sdtformatlock" xmlns:w16se="http://schemas.microsoft.com/office/word/2015/wordml/symex">
+        <mc:Fallback xmlns:w16se="http://schemas.microsoft.com/office/word/2015/wordml/symex" xmlns:w16sdtfl="http://schemas.microsoft.com/office/word/2024/wordml/sdtformatlock" xmlns:w16sdtdh="http://schemas.microsoft.com/office/word/2020/wordml/sdtdatahash" xmlns:w16du="http://schemas.microsoft.com/office/word/2023/wordml/word16du" xmlns:w16="http://schemas.microsoft.com/office/word/2018/wordml" xmlns:w16cid="http://schemas.microsoft.com/office/word/2016/wordml/cid" xmlns:w16cex="http://schemas.microsoft.com/office/word/2018/wordml/cex" xmlns:w15="http://schemas.microsoft.com/office/word/2012/wordml" xmlns:oel="http://schemas.microsoft.com/office/2019/extlst" xmlns:am3d="http://schemas.microsoft.com/office/drawing/2017/model3d" xmlns:aink="http://schemas.microsoft.com/office/drawing/2016/ink" xmlns:cx8="http://schemas.microsoft.com/office/drawing/2016/5/14/chartex" xmlns:cx7="http://schemas.microsoft.com/office/drawing/2016/5/13/chartex" xmlns:cx6="http://schemas.microsoft.com/office/drawing/2016/5/12/chartex" xmlns:cx5="http://schemas.microsoft.com/office/drawing/2016/5/11/chartex" xmlns:cx4="http://schemas.microsoft.com/office/drawing/2016/5/10/chartex" xmlns:cx3="http://schemas.microsoft.com/office/drawing/2016/5/9/chartex" xmlns:cx2="http://schemas.microsoft.com/office/drawing/2015/10/21/chartex" xmlns:cx1="http://schemas.microsoft.com/office/drawing/2015/9/8/chartex" xmlns:cx="http://schemas.microsoft.com/office/drawing/2014/chartex">
           <w:pict>
             <v:rect w14:anchorId="7169B0FC" id="Rectangle 7" o:spid="_x0000_s1026" style="position:absolute;margin-left:0;margin-top:118.85pt;width:614.65pt;height:20.3pt;z-index:251676672;visibility:visible;mso-wrap-style:square;mso-wrap-distance-left:9pt;mso-wrap-distance-top:0;mso-wrap-distance-right:9pt;mso-wrap-distance-bottom:0;mso-position-horizontal:center;mso-position-horizontal-relative:page;mso-position-vertical:absolute;mso-position-vertical-relative:text;v-text-anchor:middle" o:gfxdata="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" fillcolor="#4f81bd [3204]" stroked="f" strokeweight="2pt">
               <v:fill color2="#365f91 [2404]" rotate="t" angle="270" colors="0 #4f81bd;62259f #376092" focus="100%" type="gradient"/>
@@ -7373,7 +7511,7 @@
               <wp:docPr id="9" name="Freeform 19">
                 <a:extLst xmlns:a="http://schemas.openxmlformats.org/drawingml/2006/main">
                   <a:ext uri="{FF2B5EF4-FFF2-40B4-BE49-F238E27FC236}">
-                    <a16:creationId xmlns="" xmlns:cx="http://schemas.microsoft.com/office/drawing/2014/chartex" xmlns:cx1="http://schemas.microsoft.com/office/drawing/2015/9/8/chartex" xmlns:cx2="http://schemas.microsoft.com/office/drawing/2015/10/21/chartex" xmlns:cx3="http://schemas.microsoft.com/office/drawing/2016/5/9/chartex" xmlns:cx4="http://schemas.microsoft.com/office/drawing/2016/5/10/chartex" xmlns:cx5="http://schemas.microsoft.com/office/drawing/2016/5/11/chartex" xmlns:cx6="http://schemas.microsoft.com/office/drawing/2016/5/12/chartex" xmlns:cx7="http://schemas.microsoft.com/office/drawing/2016/5/13/chartex" xmlns:cx8="http://schemas.microsoft.com/office/drawing/2016/5/14/chartex" xmlns:aink="http://schemas.microsoft.com/office/drawing/2016/ink" xmlns:am3d="http://schemas.microsoft.com/office/drawing/2017/model3d" xmlns:o="urn:schemas-microsoft-com:office:office" xmlns:oel="http://schemas.microsoft.com/office/2019/extlst" xmlns:v="urn:schemas-microsoft-com:vml" xmlns:w10="urn:schemas-microsoft-com:office:word" xmlns:w="http://schemas.openxmlformats.org/wordprocessingml/2006/main" xmlns:w15="http://schemas.microsoft.com/office/word/2012/wordml" xmlns:w16cex="http://schemas.microsoft.com/office/word/2018/wordml/cex" xmlns:w16cid="http://schemas.microsoft.com/office/word/2016/wordml/cid" xmlns:w16="http://schemas.microsoft.com/office/word/2018/wordml" xmlns:w16du="http://schemas.microsoft.com/office/word/2023/wordml/word16du" xmlns:w16sdtdh="http://schemas.microsoft.com/office/word/2020/wordml/sdtdatahash" xmlns:w16sdtfl="http://schemas.microsoft.com/office/word/2024/wordml/sdtformatlock" xmlns:w16se="http://schemas.microsoft.com/office/word/2015/wordml/symex" xmlns:a16="http://schemas.microsoft.com/office/drawing/2014/main" id="{7E1B7167-0843-9649-8C5E-3D07F055F899}"/>
+                    <a16:creationId xmlns:a16="http://schemas.microsoft.com/office/drawing/2014/main" xmlns:w16se="http://schemas.microsoft.com/office/word/2015/wordml/symex" xmlns:w16sdtfl="http://schemas.microsoft.com/office/word/2024/wordml/sdtformatlock" xmlns:w16sdtdh="http://schemas.microsoft.com/office/word/2020/wordml/sdtdatahash" xmlns:w16du="http://schemas.microsoft.com/office/word/2023/wordml/word16du" xmlns:w16="http://schemas.microsoft.com/office/word/2018/wordml" xmlns:w16cid="http://schemas.microsoft.com/office/word/2016/wordml/cid" xmlns:w16cex="http://schemas.microsoft.com/office/word/2018/wordml/cex" xmlns:w15="http://schemas.microsoft.com/office/word/2012/wordml" xmlns:w="http://schemas.openxmlformats.org/wordprocessingml/2006/main" xmlns:w10="urn:schemas-microsoft-com:office:word" xmlns:v="urn:schemas-microsoft-com:vml" xmlns:oel="http://schemas.microsoft.com/office/2019/extlst" xmlns:o="urn:schemas-microsoft-com:office:office" xmlns:am3d="http://schemas.microsoft.com/office/drawing/2017/model3d" xmlns:aink="http://schemas.microsoft.com/office/drawing/2016/ink" xmlns:cx8="http://schemas.microsoft.com/office/drawing/2016/5/14/chartex" xmlns:cx7="http://schemas.microsoft.com/office/drawing/2016/5/13/chartex" xmlns:cx6="http://schemas.microsoft.com/office/drawing/2016/5/12/chartex" xmlns:cx5="http://schemas.microsoft.com/office/drawing/2016/5/11/chartex" xmlns:cx4="http://schemas.microsoft.com/office/drawing/2016/5/10/chartex" xmlns:cx3="http://schemas.microsoft.com/office/drawing/2016/5/9/chartex" xmlns:cx2="http://schemas.microsoft.com/office/drawing/2015/10/21/chartex" xmlns:cx1="http://schemas.microsoft.com/office/drawing/2015/9/8/chartex" xmlns:cx="http://schemas.microsoft.com/office/drawing/2014/chartex" xmlns="" id="{7E1B7167-0843-9649-8C5E-3D07F055F899}"/>
                   </a:ext>
                 </a:extLst>
               </wp:docPr>
@@ -10587,7 +10725,7 @@
 </file>
 
 <file path=customXml/itemProps1.xml><?xml version="1.0" encoding="utf-8"?>
-<ds:datastoreItem xmlns:ds="http://schemas.openxmlformats.org/officeDocument/2006/customXml" ds:itemID="{99EE3F45-BC70-45AE-87FD-E7CBAF5053E7}">
+<ds:datastoreItem xmlns:ds="http://schemas.openxmlformats.org/officeDocument/2006/customXml" ds:itemID="{812B8427-B6EF-485F-A9A6-FE7B291555B7}">
   <ds:schemaRefs>
     <ds:schemaRef ds:uri="http://schemas.openxmlformats.org/officeDocument/2006/bibliography"/>
   </ds:schemaRefs>

</xml_diff>

<commit_message>
update modul 13 v3
</commit_message>
<xml_diff>
--- a/assets/file/materi/Modul Pertemuan 13 - Fitur.docx
+++ b/assets/file/materi/Modul Pertemuan 13 - Fitur.docx
@@ -97,7 +97,7 @@
           <w:sz w:val="40"/>
           <w:szCs w:val="40"/>
         </w:rPr>
-        <w:t>FITUR PADA WEBSITE</w:t>
+        <w:t>SESSION</w:t>
       </w:r>
     </w:p>
     <w:p>
@@ -390,7 +390,7 @@
           <w:szCs w:val="40"/>
         </w:rPr>
         <w:lastRenderedPageBreak/>
-        <w:t>FITUR PADA WEBSITE</w:t>
+        <w:t>session</w:t>
       </w:r>
     </w:p>
     <w:p>
@@ -3570,24 +3570,38 @@
       </w:pPr>
       <w:r>
         <w:rPr>
-          <w:rFonts w:asciiTheme="majorHAnsi" w:hAnsiTheme="majorHAnsi" w:cstheme="majorHAnsi"/>
+          <w:rFonts w:asciiTheme="majorHAnsi" w:hAnsiTheme="majorHAnsi"/>
         </w:rPr>
         <w:lastRenderedPageBreak/>
-        <w:t xml:space="preserve">Jalankan </w:t>
-      </w:r>
-      <w:r>
-        <w:rPr>
-          <w:rFonts w:asciiTheme="majorHAnsi" w:hAnsiTheme="majorHAnsi" w:cstheme="majorHAnsi"/>
+        <w:t xml:space="preserve">Buka file </w:t>
+      </w:r>
+      <w:r>
+        <w:rPr>
+          <w:rFonts w:asciiTheme="majorHAnsi" w:hAnsiTheme="majorHAnsi"/>
           <w:b/>
           <w:bCs/>
         </w:rPr>
-        <w:t xml:space="preserve">localhost:8080/Produk_Admin </w:t>
-      </w:r>
-      <w:r>
-        <w:rPr>
-          <w:rFonts w:asciiTheme="majorHAnsi" w:hAnsiTheme="majorHAnsi" w:cstheme="majorHAnsi"/>
-        </w:rPr>
-        <w:t>maka akan tampil seperti gambar berikut</w:t>
+        <w:t>Produk_Admin.php</w:t>
+      </w:r>
+      <w:r>
+        <w:rPr>
+          <w:rFonts w:asciiTheme="majorHAnsi" w:hAnsiTheme="majorHAnsi"/>
+        </w:rPr>
+        <w:t xml:space="preserve"> dari folder </w:t>
+      </w:r>
+      <w:r>
+        <w:rPr>
+          <w:rFonts w:asciiTheme="majorHAnsi" w:hAnsiTheme="majorHAnsi"/>
+          <w:b/>
+          <w:bCs/>
+        </w:rPr>
+        <w:t>App\Controllers</w:t>
+      </w:r>
+      <w:r>
+        <w:rPr>
+          <w:rFonts w:asciiTheme="majorHAnsi" w:hAnsiTheme="majorHAnsi"/>
+        </w:rPr>
+        <w:t xml:space="preserve"> dan edit serta tambahkan kode function berikut</w:t>
       </w:r>
     </w:p>
     <w:p>
@@ -3605,10 +3619,10 @@
           <w:lang w:val="en-US" w:eastAsia="en-US"/>
         </w:rPr>
         <w:drawing>
-          <wp:inline distT="0" distB="0" distL="0" distR="0" wp14:anchorId="645A9461" wp14:editId="6967D943">
-            <wp:extent cx="5040000" cy="2667539"/>
-            <wp:effectExtent l="0" t="0" r="8255" b="0"/>
-            <wp:docPr id="262" name="Picture 262"/>
+          <wp:inline distT="0" distB="0" distL="0" distR="0" wp14:anchorId="39FB594C" wp14:editId="7A9D97FD">
+            <wp:extent cx="3572374" cy="2229161"/>
+            <wp:effectExtent l="0" t="0" r="9525" b="0"/>
+            <wp:docPr id="229" name="Picture 229"/>
             <wp:cNvGraphicFramePr>
               <a:graphicFrameLocks xmlns:a="http://schemas.openxmlformats.org/drawingml/2006/main" noChangeAspect="1"/>
             </wp:cNvGraphicFramePr>
@@ -3628,7 +3642,7 @@
                   <pic:spPr>
                     <a:xfrm>
                       <a:off x="0" y="0"/>
-                      <a:ext cx="5040000" cy="2667539"/>
+                      <a:ext cx="3572374" cy="2229161"/>
                     </a:xfrm>
                     <a:prstGeom prst="rect">
                       <a:avLst/>
@@ -3644,6 +3658,10 @@
     <w:p>
       <w:pPr>
         <w:pStyle w:val="ListParagraph"/>
+        <w:numPr>
+          <w:ilvl w:val="0"/>
+          <w:numId w:val="14"/>
+        </w:numPr>
         <w:jc w:val="both"/>
         <w:rPr>
           <w:rFonts w:asciiTheme="majorHAnsi" w:hAnsiTheme="majorHAnsi" w:cstheme="majorHAnsi"/>
@@ -3653,7 +3671,7 @@
         <w:rPr>
           <w:rFonts w:asciiTheme="majorHAnsi" w:hAnsiTheme="majorHAnsi" w:cstheme="majorHAnsi"/>
         </w:rPr>
-        <w:t xml:space="preserve">Tuliskan </w:t>
+        <w:t xml:space="preserve">Jalankan </w:t>
       </w:r>
       <w:r>
         <w:rPr>
@@ -3661,13 +3679,13 @@
           <w:b/>
           <w:bCs/>
         </w:rPr>
-        <w:t>samsung</w:t>
-      </w:r>
-      <w:r>
-        <w:rPr>
-          <w:rFonts w:asciiTheme="majorHAnsi" w:hAnsiTheme="majorHAnsi" w:cstheme="majorHAnsi"/>
-        </w:rPr>
-        <w:t xml:space="preserve"> pada kolom search yang ada di pojok kanan atas dan tekan tombol search, maka akan tampil seperti gambar berikut</w:t>
+        <w:t xml:space="preserve">localhost:8080/Produk_Admin </w:t>
+      </w:r>
+      <w:r>
+        <w:rPr>
+          <w:rFonts w:asciiTheme="majorHAnsi" w:hAnsiTheme="majorHAnsi" w:cstheme="majorHAnsi"/>
+        </w:rPr>
+        <w:t>maka akan tampil seperti gambar berikut</w:t>
       </w:r>
     </w:p>
     <w:p>
@@ -3676,23 +3694,19 @@
         <w:jc w:val="both"/>
         <w:rPr>
           <w:rFonts w:asciiTheme="majorHAnsi" w:hAnsiTheme="majorHAnsi" w:cstheme="majorHAnsi"/>
-          <w:b/>
-          <w:bCs/>
-        </w:rPr>
-      </w:pPr>
-      <w:r>
-        <w:rPr>
-          <w:rFonts w:asciiTheme="majorHAnsi" w:hAnsiTheme="majorHAnsi" w:cstheme="majorHAnsi"/>
-          <w:b/>
-          <w:bCs/>
+        </w:rPr>
+      </w:pPr>
+      <w:r>
+        <w:rPr>
+          <w:rFonts w:asciiTheme="majorHAnsi" w:hAnsiTheme="majorHAnsi" w:cstheme="majorHAnsi"/>
           <w:noProof/>
           <w:lang w:val="en-US" w:eastAsia="en-US"/>
         </w:rPr>
         <w:drawing>
-          <wp:inline distT="0" distB="0" distL="0" distR="0" wp14:anchorId="0A5B1891" wp14:editId="57F4C837">
-            <wp:extent cx="5040000" cy="2678846"/>
-            <wp:effectExtent l="0" t="0" r="8255" b="7620"/>
-            <wp:docPr id="267" name="Picture 267"/>
+          <wp:inline distT="0" distB="0" distL="0" distR="0" wp14:anchorId="645A9461" wp14:editId="6967D943">
+            <wp:extent cx="5040000" cy="2667539"/>
+            <wp:effectExtent l="0" t="0" r="8255" b="0"/>
+            <wp:docPr id="262" name="Picture 262"/>
             <wp:cNvGraphicFramePr>
               <a:graphicFrameLocks xmlns:a="http://schemas.openxmlformats.org/drawingml/2006/main" noChangeAspect="1"/>
             </wp:cNvGraphicFramePr>
@@ -3712,7 +3726,7 @@
                   <pic:spPr>
                     <a:xfrm>
                       <a:off x="0" y="0"/>
-                      <a:ext cx="5040000" cy="2678846"/>
+                      <a:ext cx="5040000" cy="2667539"/>
                     </a:xfrm>
                     <a:prstGeom prst="rect">
                       <a:avLst/>
@@ -3728,10 +3742,6 @@
     <w:p>
       <w:pPr>
         <w:pStyle w:val="ListParagraph"/>
-        <w:numPr>
-          <w:ilvl w:val="0"/>
-          <w:numId w:val="14"/>
-        </w:numPr>
         <w:jc w:val="both"/>
         <w:rPr>
           <w:rFonts w:asciiTheme="majorHAnsi" w:hAnsiTheme="majorHAnsi" w:cstheme="majorHAnsi"/>
@@ -3739,37 +3749,23 @@
       </w:pPr>
       <w:r>
         <w:rPr>
-          <w:rFonts w:asciiTheme="majorHAnsi" w:hAnsiTheme="majorHAnsi"/>
-        </w:rPr>
-        <w:t xml:space="preserve">Buka file </w:t>
-      </w:r>
-      <w:r>
-        <w:rPr>
-          <w:rFonts w:asciiTheme="majorHAnsi" w:hAnsiTheme="majorHAnsi"/>
+          <w:rFonts w:asciiTheme="majorHAnsi" w:hAnsiTheme="majorHAnsi" w:cstheme="majorHAnsi"/>
+        </w:rPr>
+        <w:t xml:space="preserve">Tuliskan </w:t>
+      </w:r>
+      <w:r>
+        <w:rPr>
+          <w:rFonts w:asciiTheme="majorHAnsi" w:hAnsiTheme="majorHAnsi" w:cstheme="majorHAnsi"/>
           <w:b/>
           <w:bCs/>
         </w:rPr>
-        <w:t>Produk_Admin.php</w:t>
-      </w:r>
-      <w:r>
-        <w:rPr>
-          <w:rFonts w:asciiTheme="majorHAnsi" w:hAnsiTheme="majorHAnsi"/>
-        </w:rPr>
-        <w:t xml:space="preserve"> dari folder </w:t>
-      </w:r>
-      <w:r>
-        <w:rPr>
-          <w:rFonts w:asciiTheme="majorHAnsi" w:hAnsiTheme="majorHAnsi"/>
-          <w:b/>
-          <w:bCs/>
-        </w:rPr>
-        <w:t>App\Controllers</w:t>
-      </w:r>
-      <w:r>
-        <w:rPr>
-          <w:rFonts w:asciiTheme="majorHAnsi" w:hAnsiTheme="majorHAnsi"/>
-        </w:rPr>
-        <w:t xml:space="preserve"> dan edit serta tambahkan kode function berikut</w:t>
+        <w:t>samsung</w:t>
+      </w:r>
+      <w:r>
+        <w:rPr>
+          <w:rFonts w:asciiTheme="majorHAnsi" w:hAnsiTheme="majorHAnsi" w:cstheme="majorHAnsi"/>
+        </w:rPr>
+        <w:t xml:space="preserve"> pada kolom search yang ada di pojok kanan atas dan tekan tombol search, maka akan tampil seperti gambar berikut</w:t>
       </w:r>
     </w:p>
     <w:p>
@@ -3778,19 +3774,23 @@
         <w:jc w:val="both"/>
         <w:rPr>
           <w:rFonts w:asciiTheme="majorHAnsi" w:hAnsiTheme="majorHAnsi" w:cstheme="majorHAnsi"/>
-        </w:rPr>
-      </w:pPr>
-      <w:r>
-        <w:rPr>
-          <w:rFonts w:asciiTheme="majorHAnsi" w:hAnsiTheme="majorHAnsi" w:cstheme="majorHAnsi"/>
+          <w:b/>
+          <w:bCs/>
+        </w:rPr>
+      </w:pPr>
+      <w:r>
+        <w:rPr>
+          <w:rFonts w:asciiTheme="majorHAnsi" w:hAnsiTheme="majorHAnsi" w:cstheme="majorHAnsi"/>
+          <w:b/>
+          <w:bCs/>
           <w:noProof/>
           <w:lang w:val="en-US" w:eastAsia="en-US"/>
         </w:rPr>
         <w:drawing>
-          <wp:inline distT="0" distB="0" distL="0" distR="0" wp14:anchorId="0950CB70" wp14:editId="7B9941E7">
-            <wp:extent cx="3572374" cy="2229161"/>
-            <wp:effectExtent l="0" t="0" r="9525" b="0"/>
-            <wp:docPr id="229" name="Picture 229"/>
+          <wp:inline distT="0" distB="0" distL="0" distR="0" wp14:anchorId="0A5B1891" wp14:editId="57F4C837">
+            <wp:extent cx="5040000" cy="2678846"/>
+            <wp:effectExtent l="0" t="0" r="8255" b="7620"/>
+            <wp:docPr id="267" name="Picture 267"/>
             <wp:cNvGraphicFramePr>
               <a:graphicFrameLocks xmlns:a="http://schemas.openxmlformats.org/drawingml/2006/main" noChangeAspect="1"/>
             </wp:cNvGraphicFramePr>
@@ -3810,7 +3810,7 @@
                   <pic:spPr>
                     <a:xfrm>
                       <a:off x="0" y="0"/>
-                      <a:ext cx="3572374" cy="2229161"/>
+                      <a:ext cx="5040000" cy="2678846"/>
                     </a:xfrm>
                     <a:prstGeom prst="rect">
                       <a:avLst/>
@@ -3835,6 +3835,8 @@
           <w:rFonts w:asciiTheme="majorHAnsi" w:hAnsiTheme="majorHAnsi" w:cstheme="majorHAnsi"/>
         </w:rPr>
       </w:pPr>
+      <w:bookmarkStart w:id="0" w:name="_GoBack"/>
+      <w:bookmarkEnd w:id="0"/>
       <w:r>
         <w:rPr>
           <w:rFonts w:asciiTheme="majorHAnsi" w:hAnsiTheme="majorHAnsi" w:cstheme="majorHAnsi"/>
@@ -4826,13 +4828,7 @@
         <w:rPr>
           <w:rFonts w:asciiTheme="majorHAnsi" w:hAnsiTheme="majorHAnsi" w:cstheme="majorHAnsi"/>
         </w:rPr>
-        <w:t>Buka file</w:t>
-      </w:r>
-      <w:r>
-        <w:rPr>
-          <w:rFonts w:asciiTheme="majorHAnsi" w:hAnsiTheme="majorHAnsi" w:cstheme="majorHAnsi"/>
-        </w:rPr>
-        <w:t xml:space="preserve"> </w:t>
+        <w:t xml:space="preserve">Buka file </w:t>
       </w:r>
       <w:r>
         <w:rPr>
@@ -4840,15 +4836,7 @@
           <w:b/>
           <w:bCs/>
         </w:rPr>
-        <w:t>Dashboard</w:t>
-      </w:r>
-      <w:r>
-        <w:rPr>
-          <w:rFonts w:asciiTheme="majorHAnsi" w:hAnsiTheme="majorHAnsi" w:cstheme="majorHAnsi"/>
-          <w:b/>
-          <w:bCs/>
-        </w:rPr>
-        <w:t xml:space="preserve">.php </w:t>
+        <w:t xml:space="preserve">Dashboard.php </w:t>
       </w:r>
       <w:r>
         <w:rPr>
@@ -4882,6 +4870,8 @@
       <w:r>
         <w:rPr>
           <w:rFonts w:asciiTheme="majorHAnsi" w:hAnsiTheme="majorHAnsi" w:cstheme="majorHAnsi"/>
+          <w:noProof/>
+          <w:lang w:val="en-US" w:eastAsia="en-US"/>
         </w:rPr>
         <w:drawing>
           <wp:inline distT="0" distB="0" distL="0" distR="0" wp14:anchorId="470D009B" wp14:editId="58DD0B61">
@@ -4919,8 +4909,6 @@
           </wp:inline>
         </w:drawing>
       </w:r>
-      <w:bookmarkStart w:id="0" w:name="_GoBack"/>
-      <w:bookmarkEnd w:id="0"/>
     </w:p>
     <w:p>
       <w:pPr>
@@ -5353,7 +5341,7 @@
         <w:noProof/>
         <w:color w:val="FFFFFF"/>
       </w:rPr>
-      <w:t>12</w:t>
+      <w:t>10</w:t>
     </w:r>
     <w:r>
       <w:rPr>
@@ -6219,7 +6207,7 @@
                               <w:color w:val="FFFFFF"/>
                               <w:sz w:val="20"/>
                             </w:rPr>
-                            <w:t>CRUD DASAR</w:t>
+                            <w:t>SESSION</w:t>
                           </w:r>
                         </w:p>
                       </w:txbxContent>
@@ -6290,7 +6278,7 @@
                         <w:color w:val="FFFFFF"/>
                         <w:sz w:val="20"/>
                       </w:rPr>
-                      <w:t>CRUD DASAR</w:t>
+                      <w:t>SESSION</w:t>
                     </w:r>
                   </w:p>
                 </w:txbxContent>
@@ -6435,7 +6423,7 @@
                       <wps:cNvPr id="3" name="Parallelogram 12">
                         <a:extLst>
                           <a:ext uri="{FF2B5EF4-FFF2-40B4-BE49-F238E27FC236}">
-                            <a16:creationId xmlns:a16="http://schemas.microsoft.com/office/drawing/2014/main" xmlns:w16se="http://schemas.microsoft.com/office/word/2015/wordml/symex" xmlns:w16sdtfl="http://schemas.microsoft.com/office/word/2024/wordml/sdtformatlock" xmlns:w16sdtdh="http://schemas.microsoft.com/office/word/2020/wordml/sdtdatahash" xmlns:w16du="http://schemas.microsoft.com/office/word/2023/wordml/word16du" xmlns:w16="http://schemas.microsoft.com/office/word/2018/wordml" xmlns:w16cid="http://schemas.microsoft.com/office/word/2016/wordml/cid" xmlns:w16cex="http://schemas.microsoft.com/office/word/2018/wordml/cex" xmlns:w15="http://schemas.microsoft.com/office/word/2012/wordml" xmlns:w="http://schemas.openxmlformats.org/wordprocessingml/2006/main" xmlns:w10="urn:schemas-microsoft-com:office:word" xmlns:v="urn:schemas-microsoft-com:vml" xmlns:oel="http://schemas.microsoft.com/office/2019/extlst" xmlns:o="urn:schemas-microsoft-com:office:office" xmlns:am3d="http://schemas.microsoft.com/office/drawing/2017/model3d" xmlns:aink="http://schemas.microsoft.com/office/drawing/2016/ink" xmlns:cx8="http://schemas.microsoft.com/office/drawing/2016/5/14/chartex" xmlns:cx7="http://schemas.microsoft.com/office/drawing/2016/5/13/chartex" xmlns:cx6="http://schemas.microsoft.com/office/drawing/2016/5/12/chartex" xmlns:cx5="http://schemas.microsoft.com/office/drawing/2016/5/11/chartex" xmlns:cx4="http://schemas.microsoft.com/office/drawing/2016/5/10/chartex" xmlns:cx3="http://schemas.microsoft.com/office/drawing/2016/5/9/chartex" xmlns:cx2="http://schemas.microsoft.com/office/drawing/2015/10/21/chartex" xmlns:cx1="http://schemas.microsoft.com/office/drawing/2015/9/8/chartex" xmlns:cx="http://schemas.microsoft.com/office/drawing/2014/chartex" xmlns="" id="{0DF4DB2E-1B08-B444-B2FC-E7FB68181731}"/>
+                            <a16:creationId xmlns="" xmlns:cx="http://schemas.microsoft.com/office/drawing/2014/chartex" xmlns:cx1="http://schemas.microsoft.com/office/drawing/2015/9/8/chartex" xmlns:cx2="http://schemas.microsoft.com/office/drawing/2015/10/21/chartex" xmlns:cx3="http://schemas.microsoft.com/office/drawing/2016/5/9/chartex" xmlns:cx4="http://schemas.microsoft.com/office/drawing/2016/5/10/chartex" xmlns:cx5="http://schemas.microsoft.com/office/drawing/2016/5/11/chartex" xmlns:cx6="http://schemas.microsoft.com/office/drawing/2016/5/12/chartex" xmlns:cx7="http://schemas.microsoft.com/office/drawing/2016/5/13/chartex" xmlns:cx8="http://schemas.microsoft.com/office/drawing/2016/5/14/chartex" xmlns:aink="http://schemas.microsoft.com/office/drawing/2016/ink" xmlns:am3d="http://schemas.microsoft.com/office/drawing/2017/model3d" xmlns:o="urn:schemas-microsoft-com:office:office" xmlns:oel="http://schemas.microsoft.com/office/2019/extlst" xmlns:v="urn:schemas-microsoft-com:vml" xmlns:w10="urn:schemas-microsoft-com:office:word" xmlns:w="http://schemas.openxmlformats.org/wordprocessingml/2006/main" xmlns:w15="http://schemas.microsoft.com/office/word/2012/wordml" xmlns:w16cex="http://schemas.microsoft.com/office/word/2018/wordml/cex" xmlns:w16cid="http://schemas.microsoft.com/office/word/2016/wordml/cid" xmlns:w16="http://schemas.microsoft.com/office/word/2018/wordml" xmlns:w16du="http://schemas.microsoft.com/office/word/2023/wordml/word16du" xmlns:w16sdtdh="http://schemas.microsoft.com/office/word/2020/wordml/sdtdatahash" xmlns:w16sdtfl="http://schemas.microsoft.com/office/word/2024/wordml/sdtformatlock" xmlns:w16se="http://schemas.microsoft.com/office/word/2015/wordml/symex" xmlns:a16="http://schemas.microsoft.com/office/drawing/2014/main" id="{0DF4DB2E-1B08-B444-B2FC-E7FB68181731}"/>
                           </a:ext>
                         </a:extLst>
                       </wps:cNvPr>
@@ -6868,7 +6856,7 @@
             </wp:anchor>
           </w:drawing>
         </mc:Choice>
-        <mc:Fallback xmlns:w16se="http://schemas.microsoft.com/office/word/2015/wordml/symex" xmlns:w16sdtfl="http://schemas.microsoft.com/office/word/2024/wordml/sdtformatlock" xmlns:w16sdtdh="http://schemas.microsoft.com/office/word/2020/wordml/sdtdatahash" xmlns:w16du="http://schemas.microsoft.com/office/word/2023/wordml/word16du" xmlns:w16="http://schemas.microsoft.com/office/word/2018/wordml" xmlns:w16cid="http://schemas.microsoft.com/office/word/2016/wordml/cid" xmlns:w16cex="http://schemas.microsoft.com/office/word/2018/wordml/cex" xmlns:w15="http://schemas.microsoft.com/office/word/2012/wordml" xmlns:oel="http://schemas.microsoft.com/office/2019/extlst" xmlns:am3d="http://schemas.microsoft.com/office/drawing/2017/model3d" xmlns:aink="http://schemas.microsoft.com/office/drawing/2016/ink" xmlns:cx8="http://schemas.microsoft.com/office/drawing/2016/5/14/chartex" xmlns:cx7="http://schemas.microsoft.com/office/drawing/2016/5/13/chartex" xmlns:cx6="http://schemas.microsoft.com/office/drawing/2016/5/12/chartex" xmlns:cx5="http://schemas.microsoft.com/office/drawing/2016/5/11/chartex" xmlns:cx4="http://schemas.microsoft.com/office/drawing/2016/5/10/chartex" xmlns:cx3="http://schemas.microsoft.com/office/drawing/2016/5/9/chartex" xmlns:cx2="http://schemas.microsoft.com/office/drawing/2015/10/21/chartex" xmlns:cx1="http://schemas.microsoft.com/office/drawing/2015/9/8/chartex" xmlns:cx="http://schemas.microsoft.com/office/drawing/2014/chartex">
+        <mc:Fallback xmlns:cx="http://schemas.microsoft.com/office/drawing/2014/chartex" xmlns:cx1="http://schemas.microsoft.com/office/drawing/2015/9/8/chartex" xmlns:cx2="http://schemas.microsoft.com/office/drawing/2015/10/21/chartex" xmlns:cx3="http://schemas.microsoft.com/office/drawing/2016/5/9/chartex" xmlns:cx4="http://schemas.microsoft.com/office/drawing/2016/5/10/chartex" xmlns:cx5="http://schemas.microsoft.com/office/drawing/2016/5/11/chartex" xmlns:cx6="http://schemas.microsoft.com/office/drawing/2016/5/12/chartex" xmlns:cx7="http://schemas.microsoft.com/office/drawing/2016/5/13/chartex" xmlns:cx8="http://schemas.microsoft.com/office/drawing/2016/5/14/chartex" xmlns:aink="http://schemas.microsoft.com/office/drawing/2016/ink" xmlns:am3d="http://schemas.microsoft.com/office/drawing/2017/model3d" xmlns:oel="http://schemas.microsoft.com/office/2019/extlst" xmlns:w15="http://schemas.microsoft.com/office/word/2012/wordml" xmlns:w16cex="http://schemas.microsoft.com/office/word/2018/wordml/cex" xmlns:w16cid="http://schemas.microsoft.com/office/word/2016/wordml/cid" xmlns:w16="http://schemas.microsoft.com/office/word/2018/wordml" xmlns:w16du="http://schemas.microsoft.com/office/word/2023/wordml/word16du" xmlns:w16sdtdh="http://schemas.microsoft.com/office/word/2020/wordml/sdtdatahash" xmlns:w16sdtfl="http://schemas.microsoft.com/office/word/2024/wordml/sdtformatlock" xmlns:w16se="http://schemas.microsoft.com/office/word/2015/wordml/symex">
           <w:pict>
             <v:group w14:anchorId="20F900BE" id="Group 1" o:spid="_x0000_s1026" style="position:absolute;margin-left:398.25pt;margin-top:-37.45pt;width:159.05pt;height:174.75pt;z-index:251674624;mso-width-relative:margin;mso-height-relative:margin" coordorigin="345" coordsize="18067,19853" o:gfxdata="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">
               <v:shape id="Parallelogram 12" o:spid="_x0000_s1027" style="position:absolute;left:5066;top:6506;width:10950;height:15743;rotation:-75;visibility:visible;mso-wrap-style:square;v-text-anchor:middle" coordsize="1095750,1574861" o:gfxdata="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" path="m,874172l539848,r555902,271253l181009,1574861,,874172xe" fillcolor="#4f81bd [3204]" stroked="f" strokeweight="2pt">
@@ -7225,7 +7213,7 @@
             </wp:anchor>
           </w:drawing>
         </mc:Choice>
-        <mc:Fallback xmlns:w16se="http://schemas.microsoft.com/office/word/2015/wordml/symex" xmlns:w16sdtfl="http://schemas.microsoft.com/office/word/2024/wordml/sdtformatlock" xmlns:w16sdtdh="http://schemas.microsoft.com/office/word/2020/wordml/sdtdatahash" xmlns:w16du="http://schemas.microsoft.com/office/word/2023/wordml/word16du" xmlns:w16="http://schemas.microsoft.com/office/word/2018/wordml" xmlns:w16cid="http://schemas.microsoft.com/office/word/2016/wordml/cid" xmlns:w16cex="http://schemas.microsoft.com/office/word/2018/wordml/cex" xmlns:w15="http://schemas.microsoft.com/office/word/2012/wordml" xmlns:oel="http://schemas.microsoft.com/office/2019/extlst" xmlns:am3d="http://schemas.microsoft.com/office/drawing/2017/model3d" xmlns:aink="http://schemas.microsoft.com/office/drawing/2016/ink" xmlns:cx8="http://schemas.microsoft.com/office/drawing/2016/5/14/chartex" xmlns:cx7="http://schemas.microsoft.com/office/drawing/2016/5/13/chartex" xmlns:cx6="http://schemas.microsoft.com/office/drawing/2016/5/12/chartex" xmlns:cx5="http://schemas.microsoft.com/office/drawing/2016/5/11/chartex" xmlns:cx4="http://schemas.microsoft.com/office/drawing/2016/5/10/chartex" xmlns:cx3="http://schemas.microsoft.com/office/drawing/2016/5/9/chartex" xmlns:cx2="http://schemas.microsoft.com/office/drawing/2015/10/21/chartex" xmlns:cx1="http://schemas.microsoft.com/office/drawing/2015/9/8/chartex" xmlns:cx="http://schemas.microsoft.com/office/drawing/2014/chartex">
+        <mc:Fallback xmlns:cx="http://schemas.microsoft.com/office/drawing/2014/chartex" xmlns:cx1="http://schemas.microsoft.com/office/drawing/2015/9/8/chartex" xmlns:cx2="http://schemas.microsoft.com/office/drawing/2015/10/21/chartex" xmlns:cx3="http://schemas.microsoft.com/office/drawing/2016/5/9/chartex" xmlns:cx4="http://schemas.microsoft.com/office/drawing/2016/5/10/chartex" xmlns:cx5="http://schemas.microsoft.com/office/drawing/2016/5/11/chartex" xmlns:cx6="http://schemas.microsoft.com/office/drawing/2016/5/12/chartex" xmlns:cx7="http://schemas.microsoft.com/office/drawing/2016/5/13/chartex" xmlns:cx8="http://schemas.microsoft.com/office/drawing/2016/5/14/chartex" xmlns:aink="http://schemas.microsoft.com/office/drawing/2016/ink" xmlns:am3d="http://schemas.microsoft.com/office/drawing/2017/model3d" xmlns:oel="http://schemas.microsoft.com/office/2019/extlst" xmlns:w15="http://schemas.microsoft.com/office/word/2012/wordml" xmlns:w16cex="http://schemas.microsoft.com/office/word/2018/wordml/cex" xmlns:w16cid="http://schemas.microsoft.com/office/word/2016/wordml/cid" xmlns:w16="http://schemas.microsoft.com/office/word/2018/wordml" xmlns:w16du="http://schemas.microsoft.com/office/word/2023/wordml/word16du" xmlns:w16sdtdh="http://schemas.microsoft.com/office/word/2020/wordml/sdtdatahash" xmlns:w16sdtfl="http://schemas.microsoft.com/office/word/2024/wordml/sdtformatlock" xmlns:w16se="http://schemas.microsoft.com/office/word/2015/wordml/symex">
           <w:pict>
             <v:rect w14:anchorId="7169B0FC" id="Rectangle 7" o:spid="_x0000_s1026" style="position:absolute;margin-left:0;margin-top:118.85pt;width:614.65pt;height:20.3pt;z-index:251676672;visibility:visible;mso-wrap-style:square;mso-wrap-distance-left:9pt;mso-wrap-distance-top:0;mso-wrap-distance-right:9pt;mso-wrap-distance-bottom:0;mso-position-horizontal:center;mso-position-horizontal-relative:page;mso-position-vertical:absolute;mso-position-vertical-relative:text;v-text-anchor:middle" o:gfxdata="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" fillcolor="#4f81bd [3204]" stroked="f" strokeweight="2pt">
               <v:fill color2="#365f91 [2404]" rotate="t" angle="270" colors="0 #4f81bd;62259f #376092" focus="100%" type="gradient"/>
@@ -7511,7 +7499,7 @@
               <wp:docPr id="9" name="Freeform 19">
                 <a:extLst xmlns:a="http://schemas.openxmlformats.org/drawingml/2006/main">
                   <a:ext uri="{FF2B5EF4-FFF2-40B4-BE49-F238E27FC236}">
-                    <a16:creationId xmlns:a16="http://schemas.microsoft.com/office/drawing/2014/main" xmlns:w16se="http://schemas.microsoft.com/office/word/2015/wordml/symex" xmlns:w16sdtfl="http://schemas.microsoft.com/office/word/2024/wordml/sdtformatlock" xmlns:w16sdtdh="http://schemas.microsoft.com/office/word/2020/wordml/sdtdatahash" xmlns:w16du="http://schemas.microsoft.com/office/word/2023/wordml/word16du" xmlns:w16="http://schemas.microsoft.com/office/word/2018/wordml" xmlns:w16cid="http://schemas.microsoft.com/office/word/2016/wordml/cid" xmlns:w16cex="http://schemas.microsoft.com/office/word/2018/wordml/cex" xmlns:w15="http://schemas.microsoft.com/office/word/2012/wordml" xmlns:w="http://schemas.openxmlformats.org/wordprocessingml/2006/main" xmlns:w10="urn:schemas-microsoft-com:office:word" xmlns:v="urn:schemas-microsoft-com:vml" xmlns:oel="http://schemas.microsoft.com/office/2019/extlst" xmlns:o="urn:schemas-microsoft-com:office:office" xmlns:am3d="http://schemas.microsoft.com/office/drawing/2017/model3d" xmlns:aink="http://schemas.microsoft.com/office/drawing/2016/ink" xmlns:cx8="http://schemas.microsoft.com/office/drawing/2016/5/14/chartex" xmlns:cx7="http://schemas.microsoft.com/office/drawing/2016/5/13/chartex" xmlns:cx6="http://schemas.microsoft.com/office/drawing/2016/5/12/chartex" xmlns:cx5="http://schemas.microsoft.com/office/drawing/2016/5/11/chartex" xmlns:cx4="http://schemas.microsoft.com/office/drawing/2016/5/10/chartex" xmlns:cx3="http://schemas.microsoft.com/office/drawing/2016/5/9/chartex" xmlns:cx2="http://schemas.microsoft.com/office/drawing/2015/10/21/chartex" xmlns:cx1="http://schemas.microsoft.com/office/drawing/2015/9/8/chartex" xmlns:cx="http://schemas.microsoft.com/office/drawing/2014/chartex" xmlns="" id="{7E1B7167-0843-9649-8C5E-3D07F055F899}"/>
+                    <a16:creationId xmlns="" xmlns:cx="http://schemas.microsoft.com/office/drawing/2014/chartex" xmlns:cx1="http://schemas.microsoft.com/office/drawing/2015/9/8/chartex" xmlns:cx2="http://schemas.microsoft.com/office/drawing/2015/10/21/chartex" xmlns:cx3="http://schemas.microsoft.com/office/drawing/2016/5/9/chartex" xmlns:cx4="http://schemas.microsoft.com/office/drawing/2016/5/10/chartex" xmlns:cx5="http://schemas.microsoft.com/office/drawing/2016/5/11/chartex" xmlns:cx6="http://schemas.microsoft.com/office/drawing/2016/5/12/chartex" xmlns:cx7="http://schemas.microsoft.com/office/drawing/2016/5/13/chartex" xmlns:cx8="http://schemas.microsoft.com/office/drawing/2016/5/14/chartex" xmlns:aink="http://schemas.microsoft.com/office/drawing/2016/ink" xmlns:am3d="http://schemas.microsoft.com/office/drawing/2017/model3d" xmlns:o="urn:schemas-microsoft-com:office:office" xmlns:oel="http://schemas.microsoft.com/office/2019/extlst" xmlns:v="urn:schemas-microsoft-com:vml" xmlns:w10="urn:schemas-microsoft-com:office:word" xmlns:w="http://schemas.openxmlformats.org/wordprocessingml/2006/main" xmlns:w15="http://schemas.microsoft.com/office/word/2012/wordml" xmlns:w16cex="http://schemas.microsoft.com/office/word/2018/wordml/cex" xmlns:w16cid="http://schemas.microsoft.com/office/word/2016/wordml/cid" xmlns:w16="http://schemas.microsoft.com/office/word/2018/wordml" xmlns:w16du="http://schemas.microsoft.com/office/word/2023/wordml/word16du" xmlns:w16sdtdh="http://schemas.microsoft.com/office/word/2020/wordml/sdtdatahash" xmlns:w16sdtfl="http://schemas.microsoft.com/office/word/2024/wordml/sdtformatlock" xmlns:w16se="http://schemas.microsoft.com/office/word/2015/wordml/symex" xmlns:a16="http://schemas.microsoft.com/office/drawing/2014/main" id="{7E1B7167-0843-9649-8C5E-3D07F055F899}"/>
                   </a:ext>
                 </a:extLst>
               </wp:docPr>
@@ -10725,7 +10713,7 @@
 </file>
 
 <file path=customXml/itemProps1.xml><?xml version="1.0" encoding="utf-8"?>
-<ds:datastoreItem xmlns:ds="http://schemas.openxmlformats.org/officeDocument/2006/customXml" ds:itemID="{812B8427-B6EF-485F-A9A6-FE7B291555B7}">
+<ds:datastoreItem xmlns:ds="http://schemas.openxmlformats.org/officeDocument/2006/customXml" ds:itemID="{A7848092-9535-41EA-8958-30CF80191910}">
   <ds:schemaRefs>
     <ds:schemaRef ds:uri="http://schemas.openxmlformats.org/officeDocument/2006/bibliography"/>
   </ds:schemaRefs>

</xml_diff>

<commit_message>
update modul 13 v4
</commit_message>
<xml_diff>
--- a/assets/file/materi/Modul Pertemuan 13 - Fitur.docx
+++ b/assets/file/materi/Modul Pertemuan 13 - Fitur.docx
@@ -97,7 +97,7 @@
           <w:sz w:val="40"/>
           <w:szCs w:val="40"/>
         </w:rPr>
-        <w:t>SESSION</w:t>
+        <w:t>FITUR PADA WEBSITE</w:t>
       </w:r>
     </w:p>
     <w:p>
@@ -390,7 +390,7 @@
           <w:szCs w:val="40"/>
         </w:rPr>
         <w:lastRenderedPageBreak/>
-        <w:t>session</w:t>
+        <w:t>FITUR PADA WEBSITE</w:t>
       </w:r>
     </w:p>
     <w:p>
@@ -959,7 +959,17 @@
           <w:szCs w:val="22"/>
           <w:lang w:eastAsia="en-US"/>
         </w:rPr>
-        <w:t xml:space="preserve"> pada folder C:\xampp\htdocs atau C:\xampp\htdocs\PBW2 dan copy</w:t>
+        <w:t xml:space="preserve"> pada folder C:\xampp\htdocs atau C:\xampp\</w:t>
+      </w:r>
+      <w:bookmarkStart w:id="0" w:name="_GoBack"/>
+      <w:bookmarkEnd w:id="0"/>
+      <w:r>
+        <w:rPr>
+          <w:rFonts w:ascii="Calibri" w:eastAsia="Calibri" w:hAnsi="Calibri" w:cs="Calibri"/>
+          <w:szCs w:val="22"/>
+          <w:lang w:eastAsia="en-US"/>
+        </w:rPr>
+        <w:t>htdocs\PBW2 dan copy</w:t>
       </w:r>
       <w:r>
         <w:rPr>
@@ -3835,8 +3845,6 @@
           <w:rFonts w:asciiTheme="majorHAnsi" w:hAnsiTheme="majorHAnsi" w:cstheme="majorHAnsi"/>
         </w:rPr>
       </w:pPr>
-      <w:bookmarkStart w:id="0" w:name="_GoBack"/>
-      <w:bookmarkEnd w:id="0"/>
       <w:r>
         <w:rPr>
           <w:rFonts w:asciiTheme="majorHAnsi" w:hAnsiTheme="majorHAnsi" w:cstheme="majorHAnsi"/>
@@ -5341,7 +5349,7 @@
         <w:noProof/>
         <w:color w:val="FFFFFF"/>
       </w:rPr>
-      <w:t>10</w:t>
+      <w:t>4</w:t>
     </w:r>
     <w:r>
       <w:rPr>
@@ -5526,7 +5534,14 @@
                               <w:color w:val="FFFFFF"/>
                               <w:sz w:val="20"/>
                             </w:rPr>
-                            <w:t>stmik-wp.ac.id</w:t>
+                            <w:t>iwima</w:t>
+                          </w:r>
+                          <w:r>
+                            <w:rPr>
+                              <w:color w:val="FFFFFF"/>
+                              <w:sz w:val="20"/>
+                            </w:rPr>
+                            <w:t>.ac.id</w:t>
                           </w:r>
                         </w:p>
                       </w:txbxContent>
@@ -5590,7 +5605,14 @@
                         <w:color w:val="FFFFFF"/>
                         <w:sz w:val="20"/>
                       </w:rPr>
-                      <w:t>stmik-wp.ac.id</w:t>
+                      <w:t>iwima</w:t>
+                    </w:r>
+                    <w:r>
+                      <w:rPr>
+                        <w:color w:val="FFFFFF"/>
+                        <w:sz w:val="20"/>
+                      </w:rPr>
+                      <w:t>.ac.id</w:t>
                     </w:r>
                   </w:p>
                 </w:txbxContent>
@@ -5687,7 +5709,14 @@
                               <w:color w:val="FFFFFF"/>
                               <w:sz w:val="20"/>
                             </w:rPr>
-                            <w:t>stmik-wp.ac.id</w:t>
+                            <w:t>iwima</w:t>
+                          </w:r>
+                          <w:r>
+                            <w:rPr>
+                              <w:color w:val="FFFFFF"/>
+                              <w:sz w:val="20"/>
+                            </w:rPr>
+                            <w:t>.ac.id</w:t>
                           </w:r>
                         </w:p>
                       </w:txbxContent>
@@ -5743,7 +5772,14 @@
                         <w:color w:val="FFFFFF"/>
                         <w:sz w:val="20"/>
                       </w:rPr>
-                      <w:t>stmik-wp.ac.id</w:t>
+                      <w:t>iwima</w:t>
+                    </w:r>
+                    <w:r>
+                      <w:rPr>
+                        <w:color w:val="FFFFFF"/>
+                        <w:sz w:val="20"/>
+                      </w:rPr>
+                      <w:t>.ac.id</w:t>
                     </w:r>
                   </w:p>
                 </w:txbxContent>
@@ -6159,12 +6195,17 @@
                           <w:pPr>
                             <w:spacing w:after="0" w:line="240" w:lineRule="auto"/>
                             <w:textDirection w:val="btLr"/>
+                            <w:rPr>
+                              <w:sz w:val="22"/>
+                              <w:szCs w:val="22"/>
+                            </w:rPr>
                           </w:pPr>
                           <w:r>
                             <w:rPr>
                               <w:b/>
                               <w:color w:val="FFFFFF"/>
-                              <w:sz w:val="20"/>
+                              <w:sz w:val="18"/>
+                              <w:szCs w:val="22"/>
                             </w:rPr>
                             <w:t xml:space="preserve">PEMROGRAMAN </w:t>
                           </w:r>
@@ -6172,7 +6213,8 @@
                             <w:rPr>
                               <w:b/>
                               <w:color w:val="FFFFFF"/>
-                              <w:sz w:val="20"/>
+                              <w:sz w:val="18"/>
+                              <w:szCs w:val="22"/>
                             </w:rPr>
                             <w:t xml:space="preserve">BERBASIS </w:t>
                           </w:r>
@@ -6180,7 +6222,8 @@
                             <w:rPr>
                               <w:b/>
                               <w:color w:val="FFFFFF"/>
-                              <w:sz w:val="20"/>
+                              <w:sz w:val="18"/>
+                              <w:szCs w:val="22"/>
                             </w:rPr>
                             <w:t xml:space="preserve">WEB </w:t>
                           </w:r>
@@ -6188,7 +6231,8 @@
                             <w:rPr>
                               <w:b/>
                               <w:color w:val="FFFFFF"/>
-                              <w:sz w:val="20"/>
+                              <w:sz w:val="18"/>
+                              <w:szCs w:val="22"/>
                             </w:rPr>
                             <w:t>2</w:t>
                           </w:r>
@@ -6199,15 +6243,18 @@
                             <w:textDirection w:val="btLr"/>
                             <w:rPr>
                               <w:rFonts w:asciiTheme="minorHAnsi" w:hAnsiTheme="minorHAnsi"/>
+                              <w:sz w:val="22"/>
+                              <w:szCs w:val="22"/>
                             </w:rPr>
                           </w:pPr>
                           <w:r>
                             <w:rPr>
                               <w:b/>
                               <w:color w:val="FFFFFF"/>
-                              <w:sz w:val="20"/>
+                              <w:sz w:val="18"/>
+                              <w:szCs w:val="22"/>
                             </w:rPr>
-                            <w:t>SESSION</w:t>
+                            <w:t>FITUR PADA WEBSITE</w:t>
                           </w:r>
                         </w:p>
                       </w:txbxContent>
@@ -6230,12 +6277,17 @@
                     <w:pPr>
                       <w:spacing w:after="0" w:line="240" w:lineRule="auto"/>
                       <w:textDirection w:val="btLr"/>
+                      <w:rPr>
+                        <w:sz w:val="22"/>
+                        <w:szCs w:val="22"/>
+                      </w:rPr>
                     </w:pPr>
                     <w:r>
                       <w:rPr>
                         <w:b/>
                         <w:color w:val="FFFFFF"/>
-                        <w:sz w:val="20"/>
+                        <w:sz w:val="18"/>
+                        <w:szCs w:val="22"/>
                       </w:rPr>
                       <w:t xml:space="preserve">PEMROGRAMAN </w:t>
                     </w:r>
@@ -6243,7 +6295,8 @@
                       <w:rPr>
                         <w:b/>
                         <w:color w:val="FFFFFF"/>
-                        <w:sz w:val="20"/>
+                        <w:sz w:val="18"/>
+                        <w:szCs w:val="22"/>
                       </w:rPr>
                       <w:t xml:space="preserve">BERBASIS </w:t>
                     </w:r>
@@ -6251,7 +6304,8 @@
                       <w:rPr>
                         <w:b/>
                         <w:color w:val="FFFFFF"/>
-                        <w:sz w:val="20"/>
+                        <w:sz w:val="18"/>
+                        <w:szCs w:val="22"/>
                       </w:rPr>
                       <w:t xml:space="preserve">WEB </w:t>
                     </w:r>
@@ -6259,7 +6313,8 @@
                       <w:rPr>
                         <w:b/>
                         <w:color w:val="FFFFFF"/>
-                        <w:sz w:val="20"/>
+                        <w:sz w:val="18"/>
+                        <w:szCs w:val="22"/>
                       </w:rPr>
                       <w:t>2</w:t>
                     </w:r>
@@ -6270,15 +6325,18 @@
                       <w:textDirection w:val="btLr"/>
                       <w:rPr>
                         <w:rFonts w:asciiTheme="minorHAnsi" w:hAnsiTheme="minorHAnsi"/>
+                        <w:sz w:val="22"/>
+                        <w:szCs w:val="22"/>
                       </w:rPr>
                     </w:pPr>
                     <w:r>
                       <w:rPr>
                         <w:b/>
                         <w:color w:val="FFFFFF"/>
-                        <w:sz w:val="20"/>
+                        <w:sz w:val="18"/>
+                        <w:szCs w:val="22"/>
                       </w:rPr>
-                      <w:t>SESSION</w:t>
+                      <w:t>FITUR PADA WEBSITE</w:t>
                     </w:r>
                   </w:p>
                 </w:txbxContent>
@@ -6423,7 +6481,7 @@
                       <wps:cNvPr id="3" name="Parallelogram 12">
                         <a:extLst>
                           <a:ext uri="{FF2B5EF4-FFF2-40B4-BE49-F238E27FC236}">
-                            <a16:creationId xmlns="" xmlns:cx="http://schemas.microsoft.com/office/drawing/2014/chartex" xmlns:cx1="http://schemas.microsoft.com/office/drawing/2015/9/8/chartex" xmlns:cx2="http://schemas.microsoft.com/office/drawing/2015/10/21/chartex" xmlns:cx3="http://schemas.microsoft.com/office/drawing/2016/5/9/chartex" xmlns:cx4="http://schemas.microsoft.com/office/drawing/2016/5/10/chartex" xmlns:cx5="http://schemas.microsoft.com/office/drawing/2016/5/11/chartex" xmlns:cx6="http://schemas.microsoft.com/office/drawing/2016/5/12/chartex" xmlns:cx7="http://schemas.microsoft.com/office/drawing/2016/5/13/chartex" xmlns:cx8="http://schemas.microsoft.com/office/drawing/2016/5/14/chartex" xmlns:aink="http://schemas.microsoft.com/office/drawing/2016/ink" xmlns:am3d="http://schemas.microsoft.com/office/drawing/2017/model3d" xmlns:o="urn:schemas-microsoft-com:office:office" xmlns:oel="http://schemas.microsoft.com/office/2019/extlst" xmlns:v="urn:schemas-microsoft-com:vml" xmlns:w10="urn:schemas-microsoft-com:office:word" xmlns:w="http://schemas.openxmlformats.org/wordprocessingml/2006/main" xmlns:w15="http://schemas.microsoft.com/office/word/2012/wordml" xmlns:w16cex="http://schemas.microsoft.com/office/word/2018/wordml/cex" xmlns:w16cid="http://schemas.microsoft.com/office/word/2016/wordml/cid" xmlns:w16="http://schemas.microsoft.com/office/word/2018/wordml" xmlns:w16du="http://schemas.microsoft.com/office/word/2023/wordml/word16du" xmlns:w16sdtdh="http://schemas.microsoft.com/office/word/2020/wordml/sdtdatahash" xmlns:w16sdtfl="http://schemas.microsoft.com/office/word/2024/wordml/sdtformatlock" xmlns:w16se="http://schemas.microsoft.com/office/word/2015/wordml/symex" xmlns:a16="http://schemas.microsoft.com/office/drawing/2014/main" id="{0DF4DB2E-1B08-B444-B2FC-E7FB68181731}"/>
+                            <a16:creationId xmlns:a16="http://schemas.microsoft.com/office/drawing/2014/main" xmlns:w16se="http://schemas.microsoft.com/office/word/2015/wordml/symex" xmlns:w16sdtfl="http://schemas.microsoft.com/office/word/2024/wordml/sdtformatlock" xmlns:w16sdtdh="http://schemas.microsoft.com/office/word/2020/wordml/sdtdatahash" xmlns:w16du="http://schemas.microsoft.com/office/word/2023/wordml/word16du" xmlns:w16="http://schemas.microsoft.com/office/word/2018/wordml" xmlns:w16cid="http://schemas.microsoft.com/office/word/2016/wordml/cid" xmlns:w16cex="http://schemas.microsoft.com/office/word/2018/wordml/cex" xmlns:w15="http://schemas.microsoft.com/office/word/2012/wordml" xmlns:w="http://schemas.openxmlformats.org/wordprocessingml/2006/main" xmlns:w10="urn:schemas-microsoft-com:office:word" xmlns:v="urn:schemas-microsoft-com:vml" xmlns:oel="http://schemas.microsoft.com/office/2019/extlst" xmlns:o="urn:schemas-microsoft-com:office:office" xmlns:am3d="http://schemas.microsoft.com/office/drawing/2017/model3d" xmlns:aink="http://schemas.microsoft.com/office/drawing/2016/ink" xmlns:cx8="http://schemas.microsoft.com/office/drawing/2016/5/14/chartex" xmlns:cx7="http://schemas.microsoft.com/office/drawing/2016/5/13/chartex" xmlns:cx6="http://schemas.microsoft.com/office/drawing/2016/5/12/chartex" xmlns:cx5="http://schemas.microsoft.com/office/drawing/2016/5/11/chartex" xmlns:cx4="http://schemas.microsoft.com/office/drawing/2016/5/10/chartex" xmlns:cx3="http://schemas.microsoft.com/office/drawing/2016/5/9/chartex" xmlns:cx2="http://schemas.microsoft.com/office/drawing/2015/10/21/chartex" xmlns:cx1="http://schemas.microsoft.com/office/drawing/2015/9/8/chartex" xmlns:cx="http://schemas.microsoft.com/office/drawing/2014/chartex" xmlns="" id="{0DF4DB2E-1B08-B444-B2FC-E7FB68181731}"/>
                           </a:ext>
                         </a:extLst>
                       </wps:cNvPr>
@@ -6856,7 +6914,7 @@
             </wp:anchor>
           </w:drawing>
         </mc:Choice>
-        <mc:Fallback xmlns:cx="http://schemas.microsoft.com/office/drawing/2014/chartex" xmlns:cx1="http://schemas.microsoft.com/office/drawing/2015/9/8/chartex" xmlns:cx2="http://schemas.microsoft.com/office/drawing/2015/10/21/chartex" xmlns:cx3="http://schemas.microsoft.com/office/drawing/2016/5/9/chartex" xmlns:cx4="http://schemas.microsoft.com/office/drawing/2016/5/10/chartex" xmlns:cx5="http://schemas.microsoft.com/office/drawing/2016/5/11/chartex" xmlns:cx6="http://schemas.microsoft.com/office/drawing/2016/5/12/chartex" xmlns:cx7="http://schemas.microsoft.com/office/drawing/2016/5/13/chartex" xmlns:cx8="http://schemas.microsoft.com/office/drawing/2016/5/14/chartex" xmlns:aink="http://schemas.microsoft.com/office/drawing/2016/ink" xmlns:am3d="http://schemas.microsoft.com/office/drawing/2017/model3d" xmlns:oel="http://schemas.microsoft.com/office/2019/extlst" xmlns:w15="http://schemas.microsoft.com/office/word/2012/wordml" xmlns:w16cex="http://schemas.microsoft.com/office/word/2018/wordml/cex" xmlns:w16cid="http://schemas.microsoft.com/office/word/2016/wordml/cid" xmlns:w16="http://schemas.microsoft.com/office/word/2018/wordml" xmlns:w16du="http://schemas.microsoft.com/office/word/2023/wordml/word16du" xmlns:w16sdtdh="http://schemas.microsoft.com/office/word/2020/wordml/sdtdatahash" xmlns:w16sdtfl="http://schemas.microsoft.com/office/word/2024/wordml/sdtformatlock" xmlns:w16se="http://schemas.microsoft.com/office/word/2015/wordml/symex">
+        <mc:Fallback xmlns:w16se="http://schemas.microsoft.com/office/word/2015/wordml/symex" xmlns:w16sdtfl="http://schemas.microsoft.com/office/word/2024/wordml/sdtformatlock" xmlns:w16sdtdh="http://schemas.microsoft.com/office/word/2020/wordml/sdtdatahash" xmlns:w16du="http://schemas.microsoft.com/office/word/2023/wordml/word16du" xmlns:w16="http://schemas.microsoft.com/office/word/2018/wordml" xmlns:w16cid="http://schemas.microsoft.com/office/word/2016/wordml/cid" xmlns:w16cex="http://schemas.microsoft.com/office/word/2018/wordml/cex" xmlns:w15="http://schemas.microsoft.com/office/word/2012/wordml" xmlns:oel="http://schemas.microsoft.com/office/2019/extlst" xmlns:am3d="http://schemas.microsoft.com/office/drawing/2017/model3d" xmlns:aink="http://schemas.microsoft.com/office/drawing/2016/ink" xmlns:cx8="http://schemas.microsoft.com/office/drawing/2016/5/14/chartex" xmlns:cx7="http://schemas.microsoft.com/office/drawing/2016/5/13/chartex" xmlns:cx6="http://schemas.microsoft.com/office/drawing/2016/5/12/chartex" xmlns:cx5="http://schemas.microsoft.com/office/drawing/2016/5/11/chartex" xmlns:cx4="http://schemas.microsoft.com/office/drawing/2016/5/10/chartex" xmlns:cx3="http://schemas.microsoft.com/office/drawing/2016/5/9/chartex" xmlns:cx2="http://schemas.microsoft.com/office/drawing/2015/10/21/chartex" xmlns:cx1="http://schemas.microsoft.com/office/drawing/2015/9/8/chartex" xmlns:cx="http://schemas.microsoft.com/office/drawing/2014/chartex">
           <w:pict>
             <v:group w14:anchorId="20F900BE" id="Group 1" o:spid="_x0000_s1026" style="position:absolute;margin-left:398.25pt;margin-top:-37.45pt;width:159.05pt;height:174.75pt;z-index:251674624;mso-width-relative:margin;mso-height-relative:margin" coordorigin="345" coordsize="18067,19853" o:gfxdata="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">
               <v:shape id="Parallelogram 12" o:spid="_x0000_s1027" style="position:absolute;left:5066;top:6506;width:10950;height:15743;rotation:-75;visibility:visible;mso-wrap-style:square;v-text-anchor:middle" coordsize="1095750,1574861" o:gfxdata="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" path="m,874172l539848,r555902,271253l181009,1574861,,874172xe" fillcolor="#4f81bd [3204]" stroked="f" strokeweight="2pt">
@@ -7213,7 +7271,7 @@
             </wp:anchor>
           </w:drawing>
         </mc:Choice>
-        <mc:Fallback xmlns:cx="http://schemas.microsoft.com/office/drawing/2014/chartex" xmlns:cx1="http://schemas.microsoft.com/office/drawing/2015/9/8/chartex" xmlns:cx2="http://schemas.microsoft.com/office/drawing/2015/10/21/chartex" xmlns:cx3="http://schemas.microsoft.com/office/drawing/2016/5/9/chartex" xmlns:cx4="http://schemas.microsoft.com/office/drawing/2016/5/10/chartex" xmlns:cx5="http://schemas.microsoft.com/office/drawing/2016/5/11/chartex" xmlns:cx6="http://schemas.microsoft.com/office/drawing/2016/5/12/chartex" xmlns:cx7="http://schemas.microsoft.com/office/drawing/2016/5/13/chartex" xmlns:cx8="http://schemas.microsoft.com/office/drawing/2016/5/14/chartex" xmlns:aink="http://schemas.microsoft.com/office/drawing/2016/ink" xmlns:am3d="http://schemas.microsoft.com/office/drawing/2017/model3d" xmlns:oel="http://schemas.microsoft.com/office/2019/extlst" xmlns:w15="http://schemas.microsoft.com/office/word/2012/wordml" xmlns:w16cex="http://schemas.microsoft.com/office/word/2018/wordml/cex" xmlns:w16cid="http://schemas.microsoft.com/office/word/2016/wordml/cid" xmlns:w16="http://schemas.microsoft.com/office/word/2018/wordml" xmlns:w16du="http://schemas.microsoft.com/office/word/2023/wordml/word16du" xmlns:w16sdtdh="http://schemas.microsoft.com/office/word/2020/wordml/sdtdatahash" xmlns:w16sdtfl="http://schemas.microsoft.com/office/word/2024/wordml/sdtformatlock" xmlns:w16se="http://schemas.microsoft.com/office/word/2015/wordml/symex">
+        <mc:Fallback xmlns:w16se="http://schemas.microsoft.com/office/word/2015/wordml/symex" xmlns:w16sdtfl="http://schemas.microsoft.com/office/word/2024/wordml/sdtformatlock" xmlns:w16sdtdh="http://schemas.microsoft.com/office/word/2020/wordml/sdtdatahash" xmlns:w16du="http://schemas.microsoft.com/office/word/2023/wordml/word16du" xmlns:w16="http://schemas.microsoft.com/office/word/2018/wordml" xmlns:w16cid="http://schemas.microsoft.com/office/word/2016/wordml/cid" xmlns:w16cex="http://schemas.microsoft.com/office/word/2018/wordml/cex" xmlns:w15="http://schemas.microsoft.com/office/word/2012/wordml" xmlns:oel="http://schemas.microsoft.com/office/2019/extlst" xmlns:am3d="http://schemas.microsoft.com/office/drawing/2017/model3d" xmlns:aink="http://schemas.microsoft.com/office/drawing/2016/ink" xmlns:cx8="http://schemas.microsoft.com/office/drawing/2016/5/14/chartex" xmlns:cx7="http://schemas.microsoft.com/office/drawing/2016/5/13/chartex" xmlns:cx6="http://schemas.microsoft.com/office/drawing/2016/5/12/chartex" xmlns:cx5="http://schemas.microsoft.com/office/drawing/2016/5/11/chartex" xmlns:cx4="http://schemas.microsoft.com/office/drawing/2016/5/10/chartex" xmlns:cx3="http://schemas.microsoft.com/office/drawing/2016/5/9/chartex" xmlns:cx2="http://schemas.microsoft.com/office/drawing/2015/10/21/chartex" xmlns:cx1="http://schemas.microsoft.com/office/drawing/2015/9/8/chartex" xmlns:cx="http://schemas.microsoft.com/office/drawing/2014/chartex">
           <w:pict>
             <v:rect w14:anchorId="7169B0FC" id="Rectangle 7" o:spid="_x0000_s1026" style="position:absolute;margin-left:0;margin-top:118.85pt;width:614.65pt;height:20.3pt;z-index:251676672;visibility:visible;mso-wrap-style:square;mso-wrap-distance-left:9pt;mso-wrap-distance-top:0;mso-wrap-distance-right:9pt;mso-wrap-distance-bottom:0;mso-position-horizontal:center;mso-position-horizontal-relative:page;mso-position-vertical:absolute;mso-position-vertical-relative:text;v-text-anchor:middle" o:gfxdata="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" fillcolor="#4f81bd [3204]" stroked="f" strokeweight="2pt">
               <v:fill color2="#365f91 [2404]" rotate="t" angle="270" colors="0 #4f81bd;62259f #376092" focus="100%" type="gradient"/>
@@ -7499,7 +7557,7 @@
               <wp:docPr id="9" name="Freeform 19">
                 <a:extLst xmlns:a="http://schemas.openxmlformats.org/drawingml/2006/main">
                   <a:ext uri="{FF2B5EF4-FFF2-40B4-BE49-F238E27FC236}">
-                    <a16:creationId xmlns="" xmlns:cx="http://schemas.microsoft.com/office/drawing/2014/chartex" xmlns:cx1="http://schemas.microsoft.com/office/drawing/2015/9/8/chartex" xmlns:cx2="http://schemas.microsoft.com/office/drawing/2015/10/21/chartex" xmlns:cx3="http://schemas.microsoft.com/office/drawing/2016/5/9/chartex" xmlns:cx4="http://schemas.microsoft.com/office/drawing/2016/5/10/chartex" xmlns:cx5="http://schemas.microsoft.com/office/drawing/2016/5/11/chartex" xmlns:cx6="http://schemas.microsoft.com/office/drawing/2016/5/12/chartex" xmlns:cx7="http://schemas.microsoft.com/office/drawing/2016/5/13/chartex" xmlns:cx8="http://schemas.microsoft.com/office/drawing/2016/5/14/chartex" xmlns:aink="http://schemas.microsoft.com/office/drawing/2016/ink" xmlns:am3d="http://schemas.microsoft.com/office/drawing/2017/model3d" xmlns:o="urn:schemas-microsoft-com:office:office" xmlns:oel="http://schemas.microsoft.com/office/2019/extlst" xmlns:v="urn:schemas-microsoft-com:vml" xmlns:w10="urn:schemas-microsoft-com:office:word" xmlns:w="http://schemas.openxmlformats.org/wordprocessingml/2006/main" xmlns:w15="http://schemas.microsoft.com/office/word/2012/wordml" xmlns:w16cex="http://schemas.microsoft.com/office/word/2018/wordml/cex" xmlns:w16cid="http://schemas.microsoft.com/office/word/2016/wordml/cid" xmlns:w16="http://schemas.microsoft.com/office/word/2018/wordml" xmlns:w16du="http://schemas.microsoft.com/office/word/2023/wordml/word16du" xmlns:w16sdtdh="http://schemas.microsoft.com/office/word/2020/wordml/sdtdatahash" xmlns:w16sdtfl="http://schemas.microsoft.com/office/word/2024/wordml/sdtformatlock" xmlns:w16se="http://schemas.microsoft.com/office/word/2015/wordml/symex" xmlns:a16="http://schemas.microsoft.com/office/drawing/2014/main" id="{7E1B7167-0843-9649-8C5E-3D07F055F899}"/>
+                    <a16:creationId xmlns:a16="http://schemas.microsoft.com/office/drawing/2014/main" xmlns:w16se="http://schemas.microsoft.com/office/word/2015/wordml/symex" xmlns:w16sdtfl="http://schemas.microsoft.com/office/word/2024/wordml/sdtformatlock" xmlns:w16sdtdh="http://schemas.microsoft.com/office/word/2020/wordml/sdtdatahash" xmlns:w16du="http://schemas.microsoft.com/office/word/2023/wordml/word16du" xmlns:w16="http://schemas.microsoft.com/office/word/2018/wordml" xmlns:w16cid="http://schemas.microsoft.com/office/word/2016/wordml/cid" xmlns:w16cex="http://schemas.microsoft.com/office/word/2018/wordml/cex" xmlns:w15="http://schemas.microsoft.com/office/word/2012/wordml" xmlns:w="http://schemas.openxmlformats.org/wordprocessingml/2006/main" xmlns:w10="urn:schemas-microsoft-com:office:word" xmlns:v="urn:schemas-microsoft-com:vml" xmlns:oel="http://schemas.microsoft.com/office/2019/extlst" xmlns:o="urn:schemas-microsoft-com:office:office" xmlns:am3d="http://schemas.microsoft.com/office/drawing/2017/model3d" xmlns:aink="http://schemas.microsoft.com/office/drawing/2016/ink" xmlns:cx8="http://schemas.microsoft.com/office/drawing/2016/5/14/chartex" xmlns:cx7="http://schemas.microsoft.com/office/drawing/2016/5/13/chartex" xmlns:cx6="http://schemas.microsoft.com/office/drawing/2016/5/12/chartex" xmlns:cx5="http://schemas.microsoft.com/office/drawing/2016/5/11/chartex" xmlns:cx4="http://schemas.microsoft.com/office/drawing/2016/5/10/chartex" xmlns:cx3="http://schemas.microsoft.com/office/drawing/2016/5/9/chartex" xmlns:cx2="http://schemas.microsoft.com/office/drawing/2015/10/21/chartex" xmlns:cx1="http://schemas.microsoft.com/office/drawing/2015/9/8/chartex" xmlns:cx="http://schemas.microsoft.com/office/drawing/2014/chartex" xmlns="" id="{7E1B7167-0843-9649-8C5E-3D07F055F899}"/>
                   </a:ext>
                 </a:extLst>
               </wp:docPr>
@@ -10713,7 +10771,7 @@
 </file>
 
 <file path=customXml/itemProps1.xml><?xml version="1.0" encoding="utf-8"?>
-<ds:datastoreItem xmlns:ds="http://schemas.openxmlformats.org/officeDocument/2006/customXml" ds:itemID="{A7848092-9535-41EA-8958-30CF80191910}">
+<ds:datastoreItem xmlns:ds="http://schemas.openxmlformats.org/officeDocument/2006/customXml" ds:itemID="{EF2FC6B1-5400-4A7B-B0E5-D2DBC156E56B}">
   <ds:schemaRefs>
     <ds:schemaRef ds:uri="http://schemas.openxmlformats.org/officeDocument/2006/bibliography"/>
   </ds:schemaRefs>

</xml_diff>